<commit_message>
Data Model Explorer: user guide screenshots with marked click targets
17 screenshots of the import-test model, each with red boxes and numbered
markers where you click, matched by numbered steps in the guide. Corrects
where Template, Dataverse check and Manage files live (More menu and the
workbook selector). Scripts that retake and mark the screenshots are in tools/.

Co-Authored-By: Claude Opus 5.5 <noreply@anthropic.com>
Claude-Session: https://claude.ai/code/session_01SKe3s5TvTWyeqUT38hd6Ss
</commit_message>
<xml_diff>
--- a/data-model-explorer/docs/User_Guide.docx
+++ b/data-model-explorer/docs/User_Guide.docx
@@ -292,7 +292,7 @@
       </w:r>
     </w:p>
     <w:bookmarkEnd w:id="20"/>
-    <w:bookmarkStart w:id="21" w:name="opening-uploading-a-workbook"/>
+    <w:bookmarkStart w:id="24" w:name="opening-uploading-a-workbook"/>
     <w:p>
       <w:pPr>
         <w:pStyle w:val="Heading2"/>
@@ -422,6 +422,89 @@
     </w:p>
     <w:p>
       <w:pPr>
+        <w:pStyle w:val="CaptionedFigure"/>
+      </w:pPr>
+      <w:r>
+        <w:drawing>
+          <wp:inline>
+            <wp:extent cx="5334000" cy="3185583"/>
+            <wp:effectExtent b="0" l="0" r="0" t="0"/>
+            <wp:docPr descr="Open workbook… in the header" title="" id="22" name="Picture"/>
+            <a:graphic>
+              <a:graphicData uri="http://schemas.openxmlformats.org/drawingml/2006/picture">
+                <pic:pic>
+                  <pic:nvPicPr>
+                    <pic:cNvPr descr="images/01-open.png" id="23" name="Picture"/>
+                    <pic:cNvPicPr>
+                      <a:picLocks noChangeArrowheads="1" noChangeAspect="1"/>
+                    </pic:cNvPicPr>
+                  </pic:nvPicPr>
+                  <pic:blipFill>
+                    <a:blip r:embed="rId21"/>
+                    <a:stretch>
+                      <a:fillRect/>
+                    </a:stretch>
+                  </pic:blipFill>
+                  <pic:spPr bwMode="auto">
+                    <a:xfrm>
+                      <a:off x="0" y="0"/>
+                      <a:ext cx="5334000" cy="3185583"/>
+                    </a:xfrm>
+                    <a:prstGeom prst="rect">
+                      <a:avLst/>
+                    </a:prstGeom>
+                    <a:noFill/>
+                    <a:ln w="9525">
+                      <a:noFill/>
+                      <a:headEnd/>
+                      <a:tailEnd/>
+                    </a:ln>
+                  </pic:spPr>
+                </pic:pic>
+              </a:graphicData>
+            </a:graphic>
+          </wp:inline>
+        </w:drawing>
+      </w:r>
+    </w:p>
+    <w:p>
+      <w:pPr>
+        <w:pStyle w:val="ImageCaption"/>
+      </w:pPr>
+      <w:r>
+        <w:t xml:space="preserve">Open workbook… in the header</w:t>
+      </w:r>
+    </w:p>
+    <w:p>
+      <w:pPr>
+        <w:pStyle w:val="BodyText"/>
+      </w:pPr>
+      <w:r>
+        <w:rPr>
+          <w:bCs/>
+          <w:b/>
+        </w:rPr>
+        <w:t xml:space="preserve">Browsers.</w:t>
+      </w:r>
+      <w:r>
+        <w:t xml:space="preserve"> </w:t>
+      </w:r>
+      <w:r>
+        <w:t xml:space="preserve">Chrome or Edge. Saving back to the original file uses a feature only those browsers have; everything else also works in other modern browsers.</w:t>
+      </w:r>
+    </w:p>
+    <w:bookmarkEnd w:id="24"/>
+    <w:bookmarkStart w:id="28" w:name="switching-between-workbooks"/>
+    <w:p>
+      <w:pPr>
+        <w:pStyle w:val="Heading2"/>
+      </w:pPr>
+      <w:r>
+        <w:t xml:space="preserve">Switching between workbooks</w:t>
+      </w:r>
+    </w:p>
+    <w:p>
+      <w:pPr>
         <w:pStyle w:val="FirstParagraph"/>
       </w:pPr>
       <w:r>
@@ -429,23 +512,228 @@
           <w:bCs/>
           <w:b/>
         </w:rPr>
-        <w:t xml:space="preserve">Browsers.</w:t>
-      </w:r>
-      <w:r>
-        <w:t xml:space="preserve"> </w:t>
-      </w:r>
-      <w:r>
-        <w:t xml:space="preserve">Chrome or Edge. Saving back to the original file uses a feature only those browsers have; everything else also works in other modern browsers.</w:t>
-      </w:r>
-    </w:p>
-    <w:bookmarkEnd w:id="21"/>
-    <w:bookmarkStart w:id="22" w:name="switching-between-workbooks"/>
+        <w:t xml:space="preserve">Opening a second file.</w:t>
+      </w:r>
+      <w:r>
+        <w:t xml:space="preserve"> </w:t>
+      </w:r>
+      <w:r>
+        <w:t xml:space="preserve">When a workbook with edits is open, the page asks whether the new file is a</w:t>
+      </w:r>
+      <w:r>
+        <w:t xml:space="preserve"> </w:t>
+      </w:r>
+      <w:r>
+        <w:rPr>
+          <w:bCs/>
+          <w:b/>
+        </w:rPr>
+        <w:t xml:space="preserve">newer version of the same workbook</w:t>
+      </w:r>
+      <w:r>
+        <w:t xml:space="preserve"> </w:t>
+      </w:r>
+      <w:r>
+        <w:t xml:space="preserve">(your edits carry over and the differences are shown) or a</w:t>
+      </w:r>
+      <w:r>
+        <w:t xml:space="preserve"> </w:t>
+      </w:r>
+      <w:r>
+        <w:rPr>
+          <w:bCs/>
+          <w:b/>
+        </w:rPr>
+        <w:t xml:space="preserve">different workbook</w:t>
+      </w:r>
+      <w:r>
+        <w:t xml:space="preserve"> </w:t>
+      </w:r>
+      <w:r>
+        <w:t xml:space="preserve">(it gets its own, separate set of edits).</w:t>
+      </w:r>
+    </w:p>
+    <w:p>
+      <w:pPr>
+        <w:pStyle w:val="BodyText"/>
+      </w:pPr>
+      <w:r>
+        <w:rPr>
+          <w:bCs/>
+          <w:b/>
+        </w:rPr>
+        <w:t xml:space="preserve">The workbook selector.</w:t>
+      </w:r>
+      <w:r>
+        <w:t xml:space="preserve"> </w:t>
+      </w:r>
+      <w:r>
+        <w:t xml:space="preserve">The button with the workbook’s name in the header lists every workbook kept in this browser; pick one to switch.</w:t>
+      </w:r>
+      <w:r>
+        <w:t xml:space="preserve"> </w:t>
+      </w:r>
+      <w:r>
+        <w:rPr>
+          <w:bCs/>
+          <w:b/>
+        </w:rPr>
+        <w:t xml:space="preserve">Manage files…</w:t>
+      </w:r>
+      <w:r>
+        <w:t xml:space="preserve"> </w:t>
+      </w:r>
+      <w:r>
+        <w:t xml:space="preserve">in the same menu shows them all, and</w:t>
+      </w:r>
+      <w:r>
+        <w:t xml:space="preserve"> </w:t>
+      </w:r>
+      <w:r>
+        <w:rPr>
+          <w:bCs/>
+          <w:b/>
+        </w:rPr>
+        <w:t xml:space="preserve">Remove all…</w:t>
+      </w:r>
+      <w:r>
+        <w:t xml:space="preserve"> </w:t>
+      </w:r>
+      <w:r>
+        <w:t xml:space="preserve">there clears them.</w:t>
+      </w:r>
+    </w:p>
+    <w:p>
+      <w:pPr>
+        <w:pStyle w:val="CaptionedFigure"/>
+      </w:pPr>
+      <w:r>
+        <w:drawing>
+          <wp:inline>
+            <wp:extent cx="4242816" cy="2414016"/>
+            <wp:effectExtent b="0" l="0" r="0" t="0"/>
+            <wp:docPr descr="The workbook selector" title="" id="26" name="Picture"/>
+            <a:graphic>
+              <a:graphicData uri="http://schemas.openxmlformats.org/drawingml/2006/picture">
+                <pic:pic>
+                  <pic:nvPicPr>
+                    <pic:cNvPr descr="images/03-workbooks.png" id="27" name="Picture"/>
+                    <pic:cNvPicPr>
+                      <a:picLocks noChangeArrowheads="1" noChangeAspect="1"/>
+                    </pic:cNvPicPr>
+                  </pic:nvPicPr>
+                  <pic:blipFill>
+                    <a:blip r:embed="rId25"/>
+                    <a:stretch>
+                      <a:fillRect/>
+                    </a:stretch>
+                  </pic:blipFill>
+                  <pic:spPr bwMode="auto">
+                    <a:xfrm>
+                      <a:off x="0" y="0"/>
+                      <a:ext cx="4242816" cy="2414016"/>
+                    </a:xfrm>
+                    <a:prstGeom prst="rect">
+                      <a:avLst/>
+                    </a:prstGeom>
+                    <a:noFill/>
+                    <a:ln w="9525">
+                      <a:noFill/>
+                      <a:headEnd/>
+                      <a:tailEnd/>
+                    </a:ln>
+                  </pic:spPr>
+                </pic:pic>
+              </a:graphicData>
+            </a:graphic>
+          </wp:inline>
+        </w:drawing>
+      </w:r>
+    </w:p>
+    <w:p>
+      <w:pPr>
+        <w:pStyle w:val="ImageCaption"/>
+      </w:pPr>
+      <w:r>
+        <w:t xml:space="preserve">The workbook selector</w:t>
+      </w:r>
+    </w:p>
+    <w:p>
+      <w:pPr>
+        <w:pStyle w:val="BodyText"/>
+      </w:pPr>
+      <w:r>
+        <w:rPr>
+          <w:bCs/>
+          <w:b/>
+        </w:rPr>
+        <w:t xml:space="preserve">1</w:t>
+      </w:r>
+      <w:r>
+        <w:t xml:space="preserve"> </w:t>
+      </w:r>
+      <w:r>
+        <w:t xml:space="preserve">The workbook selector ·</w:t>
+      </w:r>
+      <w:r>
+        <w:t xml:space="preserve"> </w:t>
+      </w:r>
+      <w:r>
+        <w:rPr>
+          <w:bCs/>
+          <w:b/>
+        </w:rPr>
+        <w:t xml:space="preserve">2</w:t>
+      </w:r>
+      <w:r>
+        <w:t xml:space="preserve"> </w:t>
+      </w:r>
+      <w:r>
+        <w:t xml:space="preserve">Manage files…</w:t>
+      </w:r>
+    </w:p>
+    <w:p>
+      <w:pPr>
+        <w:pStyle w:val="BodyText"/>
+      </w:pPr>
+      <w:r>
+        <w:rPr>
+          <w:bCs/>
+          <w:b/>
+        </w:rPr>
+        <w:t xml:space="preserve">Where things are kept.</w:t>
+      </w:r>
+      <w:r>
+        <w:t xml:space="preserve"> </w:t>
+      </w:r>
+      <w:r>
+        <w:t xml:space="preserve">Open workbooks are stored in the browser (IndexedDB) and your edits, column choices and ERD layouts in local storage, for this browser profile only. They are not in the HTML file, so anyone you send the file to starts with just the empty template. The</w:t>
+      </w:r>
+      <w:r>
+        <w:t xml:space="preserve"> </w:t>
+      </w:r>
+      <w:r>
+        <w:rPr>
+          <w:bCs/>
+          <w:b/>
+        </w:rPr>
+        <w:t xml:space="preserve">Saved</w:t>
+      </w:r>
+      <w:r>
+        <w:t xml:space="preserve"> </w:t>
+      </w:r>
+      <w:r>
+        <w:t xml:space="preserve">label in the header confirms edits are stored; if the browser refuses to store them it says so.</w:t>
+      </w:r>
+    </w:p>
+    <w:bookmarkEnd w:id="28"/>
+    <w:bookmarkStart w:id="32" w:name="loading-a-new-version"/>
     <w:p>
       <w:pPr>
         <w:pStyle w:val="Heading2"/>
       </w:pPr>
       <w:r>
-        <w:t xml:space="preserve">Switching between workbooks</w:t>
+        <w:t xml:space="preserve">Loading a new version</w:t>
       </w:r>
     </w:p>
     <w:p>
@@ -453,49 +741,94 @@
         <w:pStyle w:val="FirstParagraph"/>
       </w:pPr>
       <w:r>
-        <w:rPr>
-          <w:bCs/>
-          <w:b/>
-        </w:rPr>
-        <w:t xml:space="preserve">Opening a second file.</w:t>
-      </w:r>
-      <w:r>
-        <w:t xml:space="preserve"> </w:t>
-      </w:r>
-      <w:r>
-        <w:t xml:space="preserve">When a workbook with edits is open, the page asks whether the new file is a</w:t>
-      </w:r>
-      <w:r>
-        <w:t xml:space="preserve"> </w:t>
-      </w:r>
-      <w:r>
-        <w:rPr>
-          <w:bCs/>
-          <w:b/>
-        </w:rPr>
-        <w:t xml:space="preserve">newer version of the same workbook</w:t>
-      </w:r>
-      <w:r>
-        <w:t xml:space="preserve"> </w:t>
-      </w:r>
-      <w:r>
-        <w:t xml:space="preserve">(your edits carry over and the differences are shown) or a</w:t>
-      </w:r>
-      <w:r>
-        <w:t xml:space="preserve"> </w:t>
-      </w:r>
-      <w:r>
-        <w:rPr>
-          <w:bCs/>
-          <w:b/>
-        </w:rPr>
-        <w:t xml:space="preserve">different workbook</w:t>
-      </w:r>
-      <w:r>
-        <w:t xml:space="preserve"> </w:t>
-      </w:r>
-      <w:r>
-        <w:t xml:space="preserve">(it gets its own, separate set of edits).</w:t>
+        <w:t xml:space="preserve">Click</w:t>
+      </w:r>
+      <w:r>
+        <w:t xml:space="preserve"> </w:t>
+      </w:r>
+      <w:r>
+        <w:rPr>
+          <w:bCs/>
+          <w:b/>
+        </w:rPr>
+        <w:t xml:space="preserve">Load version…</w:t>
+      </w:r>
+      <w:r>
+        <w:t xml:space="preserve"> </w:t>
+      </w:r>
+      <w:r>
+        <w:t xml:space="preserve">(or drop the new file on the page) and choose</w:t>
+      </w:r>
+      <w:r>
+        <w:t xml:space="preserve"> </w:t>
+      </w:r>
+      <w:r>
+        <w:rPr>
+          <w:bCs/>
+          <w:b/>
+        </w:rPr>
+        <w:t xml:space="preserve">newer version</w:t>
+      </w:r>
+      <w:r>
+        <w:t xml:space="preserve"> </w:t>
+      </w:r>
+      <w:r>
+        <w:t xml:space="preserve">when asked.</w:t>
+      </w:r>
+    </w:p>
+    <w:p>
+      <w:pPr>
+        <w:pStyle w:val="CaptionedFigure"/>
+      </w:pPr>
+      <w:r>
+        <w:drawing>
+          <wp:inline>
+            <wp:extent cx="2880360" cy="2099245"/>
+            <wp:effectExtent b="0" l="0" r="0" t="0"/>
+            <wp:docPr descr="Carry your edits over?" title="" id="30" name="Picture"/>
+            <a:graphic>
+              <a:graphicData uri="http://schemas.openxmlformats.org/drawingml/2006/picture">
+                <pic:pic>
+                  <pic:nvPicPr>
+                    <pic:cNvPr descr="images/13-loadversion.png" id="31" name="Picture"/>
+                    <pic:cNvPicPr>
+                      <a:picLocks noChangeArrowheads="1" noChangeAspect="1"/>
+                    </pic:cNvPicPr>
+                  </pic:nvPicPr>
+                  <pic:blipFill>
+                    <a:blip r:embed="rId29"/>
+                    <a:stretch>
+                      <a:fillRect/>
+                    </a:stretch>
+                  </pic:blipFill>
+                  <pic:spPr bwMode="auto">
+                    <a:xfrm>
+                      <a:off x="0" y="0"/>
+                      <a:ext cx="2880360" cy="2099245"/>
+                    </a:xfrm>
+                    <a:prstGeom prst="rect">
+                      <a:avLst/>
+                    </a:prstGeom>
+                    <a:noFill/>
+                    <a:ln w="9525">
+                      <a:noFill/>
+                      <a:headEnd/>
+                      <a:tailEnd/>
+                    </a:ln>
+                  </pic:spPr>
+                </pic:pic>
+              </a:graphicData>
+            </a:graphic>
+          </wp:inline>
+        </w:drawing>
+      </w:r>
+    </w:p>
+    <w:p>
+      <w:pPr>
+        <w:pStyle w:val="ImageCaption"/>
+      </w:pPr>
+      <w:r>
+        <w:t xml:space="preserve">Carry your edits over?</w:t>
       </w:r>
     </w:p>
     <w:p>
@@ -507,142 +840,29 @@
           <w:bCs/>
           <w:b/>
         </w:rPr>
-        <w:t xml:space="preserve">The workbook selector.</w:t>
-      </w:r>
-      <w:r>
-        <w:t xml:space="preserve"> </w:t>
-      </w:r>
-      <w:r>
-        <w:t xml:space="preserve">The button with the workbook’s name in the header lists every workbook kept in this browser; pick one to switch.</w:t>
-      </w:r>
-      <w:r>
-        <w:t xml:space="preserve"> </w:t>
-      </w:r>
-      <w:r>
-        <w:rPr>
-          <w:bCs/>
-          <w:b/>
-        </w:rPr>
-        <w:t xml:space="preserve">Files</w:t>
-      </w:r>
-      <w:r>
-        <w:t xml:space="preserve"> </w:t>
-      </w:r>
-      <w:r>
-        <w:t xml:space="preserve">(or</w:t>
-      </w:r>
-      <w:r>
-        <w:t xml:space="preserve"> </w:t>
-      </w:r>
-      <w:r>
-        <w:rPr>
-          <w:bCs/>
-          <w:b/>
-        </w:rPr>
-        <w:t xml:space="preserve">Manage files…</w:t>
-      </w:r>
-      <w:r>
-        <w:t xml:space="preserve">) shows them all, and</w:t>
-      </w:r>
-      <w:r>
-        <w:t xml:space="preserve"> </w:t>
-      </w:r>
-      <w:r>
-        <w:rPr>
-          <w:bCs/>
-          <w:b/>
-        </w:rPr>
-        <w:t xml:space="preserve">Remove all…</w:t>
-      </w:r>
-      <w:r>
-        <w:t xml:space="preserve"> </w:t>
-      </w:r>
-      <w:r>
-        <w:t xml:space="preserve">clears them.</w:t>
-      </w:r>
-    </w:p>
-    <w:p>
-      <w:pPr>
-        <w:pStyle w:val="BodyText"/>
-      </w:pPr>
-      <w:r>
-        <w:rPr>
-          <w:bCs/>
-          <w:b/>
-        </w:rPr>
-        <w:t xml:space="preserve">Where things are kept.</w:t>
-      </w:r>
-      <w:r>
-        <w:t xml:space="preserve"> </w:t>
-      </w:r>
-      <w:r>
-        <w:t xml:space="preserve">Open workbooks are stored in the browser (IndexedDB) and your edits, column choices and ERD layouts in local storage, for this browser profile only. They are not in the HTML file, so anyone you send the file to starts with just the empty template. The</w:t>
-      </w:r>
-      <w:r>
-        <w:t xml:space="preserve"> </w:t>
-      </w:r>
-      <w:r>
-        <w:rPr>
-          <w:bCs/>
-          <w:b/>
-        </w:rPr>
-        <w:t xml:space="preserve">Saved</w:t>
-      </w:r>
-      <w:r>
-        <w:t xml:space="preserve"> </w:t>
-      </w:r>
-      <w:r>
-        <w:t xml:space="preserve">label in the header confirms edits are stored; if the browser refuses to store them it says so.</w:t>
-      </w:r>
-    </w:p>
-    <w:bookmarkEnd w:id="22"/>
-    <w:bookmarkStart w:id="23" w:name="loading-a-new-version"/>
-    <w:p>
-      <w:pPr>
-        <w:pStyle w:val="Heading2"/>
-      </w:pPr>
-      <w:r>
-        <w:t xml:space="preserve">Loading a new version</w:t>
-      </w:r>
-    </w:p>
-    <w:p>
-      <w:pPr>
-        <w:pStyle w:val="FirstParagraph"/>
-      </w:pPr>
-      <w:r>
-        <w:t xml:space="preserve">Click</w:t>
-      </w:r>
-      <w:r>
-        <w:t xml:space="preserve"> </w:t>
-      </w:r>
-      <w:r>
-        <w:rPr>
-          <w:bCs/>
-          <w:b/>
-        </w:rPr>
-        <w:t xml:space="preserve">Load version…</w:t>
-      </w:r>
-      <w:r>
-        <w:t xml:space="preserve"> </w:t>
-      </w:r>
-      <w:r>
-        <w:t xml:space="preserve">(or drop the new file on the page) and choose</w:t>
-      </w:r>
-      <w:r>
-        <w:t xml:space="preserve"> </w:t>
-      </w:r>
-      <w:r>
-        <w:rPr>
-          <w:bCs/>
-          <w:b/>
-        </w:rPr>
-        <w:t xml:space="preserve">newer version</w:t>
-      </w:r>
-      <w:r>
-        <w:t xml:space="preserve"> </w:t>
-      </w:r>
-      <w:r>
-        <w:t xml:space="preserve">when asked.</w:t>
+        <w:t xml:space="preserve">1</w:t>
+      </w:r>
+      <w:r>
+        <w:t xml:space="preserve"> </w:t>
+      </w:r>
+      <w:r>
+        <w:t xml:space="preserve">Newer version: carry edits over ·</w:t>
+      </w:r>
+      <w:r>
+        <w:t xml:space="preserve"> </w:t>
+      </w:r>
+      <w:r>
+        <w:rPr>
+          <w:bCs/>
+          <w:b/>
+        </w:rPr>
+        <w:t xml:space="preserve">2</w:t>
+      </w:r>
+      <w:r>
+        <w:t xml:space="preserve"> </w:t>
+      </w:r>
+      <w:r>
+        <w:t xml:space="preserve">Different workbook: a separate set of edits</w:t>
       </w:r>
     </w:p>
     <w:p>
@@ -752,8 +972,8 @@
         <w:t xml:space="preserve">Rows you added are carried over too. If the new version already has a field with the same logical name, you choose whether to keep the new version’s or add yours as well.</w:t>
       </w:r>
     </w:p>
-    <w:bookmarkEnd w:id="23"/>
-    <w:bookmarkStart w:id="24" w:name="the-overview"/>
+    <w:bookmarkEnd w:id="32"/>
+    <w:bookmarkStart w:id="36" w:name="the-overview"/>
     <w:p>
       <w:pPr>
         <w:pStyle w:val="Heading2"/>
@@ -1031,14 +1251,135 @@
     </w:tbl>
     <w:p>
       <w:pPr>
+        <w:pStyle w:val="CaptionedFigure"/>
+      </w:pPr>
+      <w:r>
+        <w:drawing>
+          <wp:inline>
+            <wp:extent cx="5334000" cy="3185583"/>
+            <wp:effectExtent b="0" l="0" r="0" t="0"/>
+            <wp:docPr descr="The Overview" title="" id="34" name="Picture"/>
+            <a:graphic>
+              <a:graphicData uri="http://schemas.openxmlformats.org/drawingml/2006/picture">
+                <pic:pic>
+                  <pic:nvPicPr>
+                    <pic:cNvPr descr="images/02-overview.png" id="35" name="Picture"/>
+                    <pic:cNvPicPr>
+                      <a:picLocks noChangeArrowheads="1" noChangeAspect="1"/>
+                    </pic:cNvPicPr>
+                  </pic:nvPicPr>
+                  <pic:blipFill>
+                    <a:blip r:embed="rId33"/>
+                    <a:stretch>
+                      <a:fillRect/>
+                    </a:stretch>
+                  </pic:blipFill>
+                  <pic:spPr bwMode="auto">
+                    <a:xfrm>
+                      <a:off x="0" y="0"/>
+                      <a:ext cx="5334000" cy="3185583"/>
+                    </a:xfrm>
+                    <a:prstGeom prst="rect">
+                      <a:avLst/>
+                    </a:prstGeom>
+                    <a:noFill/>
+                    <a:ln w="9525">
+                      <a:noFill/>
+                      <a:headEnd/>
+                      <a:tailEnd/>
+                    </a:ln>
+                  </pic:spPr>
+                </pic:pic>
+              </a:graphicData>
+            </a:graphic>
+          </wp:inline>
+        </w:drawing>
+      </w:r>
+    </w:p>
+    <w:p>
+      <w:pPr>
+        <w:pStyle w:val="ImageCaption"/>
+      </w:pPr>
+      <w:r>
+        <w:t xml:space="preserve">The Overview</w:t>
+      </w:r>
+    </w:p>
+    <w:p>
+      <w:pPr>
         <w:pStyle w:val="BodyText"/>
       </w:pPr>
       <w:r>
+        <w:rPr>
+          <w:bCs/>
+          <w:b/>
+        </w:rPr>
+        <w:t xml:space="preserve">1</w:t>
+      </w:r>
+      <w:r>
+        <w:t xml:space="preserve"> </w:t>
+      </w:r>
+      <w:r>
+        <w:t xml:space="preserve">Count cards open their list ·</w:t>
+      </w:r>
+      <w:r>
+        <w:t xml:space="preserve"> </w:t>
+      </w:r>
+      <w:r>
+        <w:rPr>
+          <w:bCs/>
+          <w:b/>
+        </w:rPr>
+        <w:t xml:space="preserve">2</w:t>
+      </w:r>
+      <w:r>
+        <w:t xml:space="preserve"> </w:t>
+      </w:r>
+      <w:r>
+        <w:t xml:space="preserve">Open all checks ·</w:t>
+      </w:r>
+      <w:r>
+        <w:t xml:space="preserve"> </w:t>
+      </w:r>
+      <w:r>
+        <w:rPr>
+          <w:bCs/>
+          <w:b/>
+        </w:rPr>
+        <w:t xml:space="preserve">3</w:t>
+      </w:r>
+      <w:r>
+        <w:t xml:space="preserve"> </w:t>
+      </w:r>
+      <w:r>
+        <w:t xml:space="preserve">Build solution… ·</w:t>
+      </w:r>
+      <w:r>
+        <w:t xml:space="preserve"> </w:t>
+      </w:r>
+      <w:r>
+        <w:rPr>
+          <w:bCs/>
+          <w:b/>
+        </w:rPr>
+        <w:t xml:space="preserve">4</w:t>
+      </w:r>
+      <w:r>
+        <w:t xml:space="preserve"> </w:t>
+      </w:r>
+      <w:r>
+        <w:t xml:space="preserve">Check against Dataverse…</w:t>
+      </w:r>
+    </w:p>
+    <w:p>
+      <w:pPr>
+        <w:pStyle w:val="BodyText"/>
+      </w:pPr>
+      <w:r>
         <w:t xml:space="preserve">When the page reopens a workbook from last time, the Overview says which one, so you can switch if it is not the one you want.</w:t>
       </w:r>
     </w:p>
-    <w:bookmarkEnd w:id="24"/>
-    <w:bookmarkStart w:id="25" w:name="checks"/>
+    <w:bookmarkEnd w:id="36"/>
+    <w:bookmarkStart w:id="40" w:name="checks"/>
     <w:p>
       <w:pPr>
         <w:pStyle w:val="Heading2"/>
@@ -1981,8 +2322,129 @@
         <w:t xml:space="preserve">downloads the list.</w:t>
       </w:r>
     </w:p>
-    <w:bookmarkEnd w:id="25"/>
-    <w:bookmarkStart w:id="26" w:name="the-erd"/>
+    <w:p>
+      <w:pPr>
+        <w:pStyle w:val="CaptionedFigure"/>
+      </w:pPr>
+      <w:r>
+        <w:drawing>
+          <wp:inline>
+            <wp:extent cx="5334000" cy="2074129"/>
+            <wp:effectExtent b="0" l="0" r="0" t="0"/>
+            <wp:docPr descr="The Checks page" title="" id="38" name="Picture"/>
+            <a:graphic>
+              <a:graphicData uri="http://schemas.openxmlformats.org/drawingml/2006/picture">
+                <pic:pic>
+                  <pic:nvPicPr>
+                    <pic:cNvPr descr="images/04-checks.png" id="39" name="Picture"/>
+                    <pic:cNvPicPr>
+                      <a:picLocks noChangeArrowheads="1" noChangeAspect="1"/>
+                    </pic:cNvPicPr>
+                  </pic:nvPicPr>
+                  <pic:blipFill>
+                    <a:blip r:embed="rId37"/>
+                    <a:stretch>
+                      <a:fillRect/>
+                    </a:stretch>
+                  </pic:blipFill>
+                  <pic:spPr bwMode="auto">
+                    <a:xfrm>
+                      <a:off x="0" y="0"/>
+                      <a:ext cx="5334000" cy="2074129"/>
+                    </a:xfrm>
+                    <a:prstGeom prst="rect">
+                      <a:avLst/>
+                    </a:prstGeom>
+                    <a:noFill/>
+                    <a:ln w="9525">
+                      <a:noFill/>
+                      <a:headEnd/>
+                      <a:tailEnd/>
+                    </a:ln>
+                  </pic:spPr>
+                </pic:pic>
+              </a:graphicData>
+            </a:graphic>
+          </wp:inline>
+        </w:drawing>
+      </w:r>
+    </w:p>
+    <w:p>
+      <w:pPr>
+        <w:pStyle w:val="ImageCaption"/>
+      </w:pPr>
+      <w:r>
+        <w:t xml:space="preserve">The Checks page</w:t>
+      </w:r>
+    </w:p>
+    <w:p>
+      <w:pPr>
+        <w:pStyle w:val="BodyText"/>
+      </w:pPr>
+      <w:r>
+        <w:rPr>
+          <w:bCs/>
+          <w:b/>
+        </w:rPr>
+        <w:t xml:space="preserve">1</w:t>
+      </w:r>
+      <w:r>
+        <w:t xml:space="preserve"> </w:t>
+      </w:r>
+      <w:r>
+        <w:t xml:space="preserve">Errors ·</w:t>
+      </w:r>
+      <w:r>
+        <w:t xml:space="preserve"> </w:t>
+      </w:r>
+      <w:r>
+        <w:rPr>
+          <w:bCs/>
+          <w:b/>
+        </w:rPr>
+        <w:t xml:space="preserve">2</w:t>
+      </w:r>
+      <w:r>
+        <w:t xml:space="preserve"> </w:t>
+      </w:r>
+      <w:r>
+        <w:t xml:space="preserve">Warnings ·</w:t>
+      </w:r>
+      <w:r>
+        <w:t xml:space="preserve"> </w:t>
+      </w:r>
+      <w:r>
+        <w:rPr>
+          <w:bCs/>
+          <w:b/>
+        </w:rPr>
+        <w:t xml:space="preserve">3</w:t>
+      </w:r>
+      <w:r>
+        <w:t xml:space="preserve"> </w:t>
+      </w:r>
+      <w:r>
+        <w:t xml:space="preserve">Info ·</w:t>
+      </w:r>
+      <w:r>
+        <w:t xml:space="preserve"> </w:t>
+      </w:r>
+      <w:r>
+        <w:rPr>
+          <w:bCs/>
+          <w:b/>
+        </w:rPr>
+        <w:t xml:space="preserve">4</w:t>
+      </w:r>
+      <w:r>
+        <w:t xml:space="preserve"> </w:t>
+      </w:r>
+      <w:r>
+        <w:t xml:space="preserve">Export (CSV)</w:t>
+      </w:r>
+    </w:p>
+    <w:bookmarkEnd w:id="40"/>
+    <w:bookmarkStart w:id="44" w:name="the-erd"/>
     <w:p>
       <w:pPr>
         <w:pStyle w:val="Heading2"/>
@@ -2220,7 +2682,112 @@
     </w:p>
     <w:p>
       <w:pPr>
-        <w:pStyle w:val="FirstParagraph"/>
+        <w:pStyle w:val="CaptionedFigure"/>
+      </w:pPr>
+      <w:r>
+        <w:drawing>
+          <wp:inline>
+            <wp:extent cx="5334000" cy="3185583"/>
+            <wp:effectExtent b="0" l="0" r="0" t="0"/>
+            <wp:docPr descr="The ERD" title="" id="42" name="Picture"/>
+            <a:graphic>
+              <a:graphicData uri="http://schemas.openxmlformats.org/drawingml/2006/picture">
+                <pic:pic>
+                  <pic:nvPicPr>
+                    <pic:cNvPr descr="images/05-erd.png" id="43" name="Picture"/>
+                    <pic:cNvPicPr>
+                      <a:picLocks noChangeArrowheads="1" noChangeAspect="1"/>
+                    </pic:cNvPicPr>
+                  </pic:nvPicPr>
+                  <pic:blipFill>
+                    <a:blip r:embed="rId41"/>
+                    <a:stretch>
+                      <a:fillRect/>
+                    </a:stretch>
+                  </pic:blipFill>
+                  <pic:spPr bwMode="auto">
+                    <a:xfrm>
+                      <a:off x="0" y="0"/>
+                      <a:ext cx="5334000" cy="3185583"/>
+                    </a:xfrm>
+                    <a:prstGeom prst="rect">
+                      <a:avLst/>
+                    </a:prstGeom>
+                    <a:noFill/>
+                    <a:ln w="9525">
+                      <a:noFill/>
+                      <a:headEnd/>
+                      <a:tailEnd/>
+                    </a:ln>
+                  </pic:spPr>
+                </pic:pic>
+              </a:graphicData>
+            </a:graphic>
+          </wp:inline>
+        </w:drawing>
+      </w:r>
+    </w:p>
+    <w:p>
+      <w:pPr>
+        <w:pStyle w:val="ImageCaption"/>
+      </w:pPr>
+      <w:r>
+        <w:t xml:space="preserve">The ERD</w:t>
+      </w:r>
+    </w:p>
+    <w:p>
+      <w:pPr>
+        <w:pStyle w:val="BodyText"/>
+      </w:pPr>
+      <w:r>
+        <w:rPr>
+          <w:bCs/>
+          <w:b/>
+        </w:rPr>
+        <w:t xml:space="preserve">1</w:t>
+      </w:r>
+      <w:r>
+        <w:t xml:space="preserve"> </w:t>
+      </w:r>
+      <w:r>
+        <w:t xml:space="preserve">All tables ·</w:t>
+      </w:r>
+      <w:r>
+        <w:t xml:space="preserve"> </w:t>
+      </w:r>
+      <w:r>
+        <w:rPr>
+          <w:bCs/>
+          <w:b/>
+        </w:rPr>
+        <w:t xml:space="preserve">2</w:t>
+      </w:r>
+      <w:r>
+        <w:t xml:space="preserve"> </w:t>
+      </w:r>
+      <w:r>
+        <w:t xml:space="preserve">Keys + lookups ·</w:t>
+      </w:r>
+      <w:r>
+        <w:t xml:space="preserve"> </w:t>
+      </w:r>
+      <w:r>
+        <w:rPr>
+          <w:bCs/>
+          <w:b/>
+        </w:rPr>
+        <w:t xml:space="preserve">3</w:t>
+      </w:r>
+      <w:r>
+        <w:t xml:space="preserve"> </w:t>
+      </w:r>
+      <w:r>
+        <w:t xml:space="preserve">Export to draw.io</w:t>
+      </w:r>
+    </w:p>
+    <w:p>
+      <w:pPr>
+        <w:pStyle w:val="BodyText"/>
       </w:pPr>
       <w:r>
         <w:rPr>
@@ -2340,8 +2907,8 @@
         <w:t xml:space="preserve">(the Mermaid source). With many tables, draw a few dozen at a time: a whole large model is slow to lay out and hard to read.</w:t>
       </w:r>
     </w:p>
-    <w:bookmarkEnd w:id="26"/>
-    <w:bookmarkStart w:id="27" w:name="browsing-and-searching-tables"/>
+    <w:bookmarkEnd w:id="44"/>
+    <w:bookmarkStart w:id="48" w:name="browsing-and-searching-tables"/>
     <w:p>
       <w:pPr>
         <w:pStyle w:val="Heading2"/>
@@ -2557,8 +3124,145 @@
         <w:t xml:space="preserve">switches between full text and two-line rows; the ▾ on a row does it for that row.</w:t>
       </w:r>
     </w:p>
-    <w:bookmarkEnd w:id="27"/>
-    <w:bookmarkStart w:id="28" w:name="editing-values"/>
+    <w:p>
+      <w:pPr>
+        <w:pStyle w:val="CaptionedFigure"/>
+      </w:pPr>
+      <w:r>
+        <w:drawing>
+          <wp:inline>
+            <wp:extent cx="5334000" cy="3185583"/>
+            <wp:effectExtent b="0" l="0" r="0" t="0"/>
+            <wp:docPr descr="A table page" title="" id="46" name="Picture"/>
+            <a:graphic>
+              <a:graphicData uri="http://schemas.openxmlformats.org/drawingml/2006/picture">
+                <pic:pic>
+                  <pic:nvPicPr>
+                    <pic:cNvPr descr="images/06-table.png" id="47" name="Picture"/>
+                    <pic:cNvPicPr>
+                      <a:picLocks noChangeArrowheads="1" noChangeAspect="1"/>
+                    </pic:cNvPicPr>
+                  </pic:nvPicPr>
+                  <pic:blipFill>
+                    <a:blip r:embed="rId45"/>
+                    <a:stretch>
+                      <a:fillRect/>
+                    </a:stretch>
+                  </pic:blipFill>
+                  <pic:spPr bwMode="auto">
+                    <a:xfrm>
+                      <a:off x="0" y="0"/>
+                      <a:ext cx="5334000" cy="3185583"/>
+                    </a:xfrm>
+                    <a:prstGeom prst="rect">
+                      <a:avLst/>
+                    </a:prstGeom>
+                    <a:noFill/>
+                    <a:ln w="9525">
+                      <a:noFill/>
+                      <a:headEnd/>
+                      <a:tailEnd/>
+                    </a:ln>
+                  </pic:spPr>
+                </pic:pic>
+              </a:graphicData>
+            </a:graphic>
+          </wp:inline>
+        </w:drawing>
+      </w:r>
+    </w:p>
+    <w:p>
+      <w:pPr>
+        <w:pStyle w:val="ImageCaption"/>
+      </w:pPr>
+      <w:r>
+        <w:t xml:space="preserve">A table page</w:t>
+      </w:r>
+    </w:p>
+    <w:p>
+      <w:pPr>
+        <w:pStyle w:val="BodyText"/>
+      </w:pPr>
+      <w:r>
+        <w:rPr>
+          <w:bCs/>
+          <w:b/>
+        </w:rPr>
+        <w:t xml:space="preserve">1</w:t>
+      </w:r>
+      <w:r>
+        <w:t xml:space="preserve"> </w:t>
+      </w:r>
+      <w:r>
+        <w:t xml:space="preserve">Search ·</w:t>
+      </w:r>
+      <w:r>
+        <w:t xml:space="preserve"> </w:t>
+      </w:r>
+      <w:r>
+        <w:rPr>
+          <w:bCs/>
+          <w:b/>
+        </w:rPr>
+        <w:t xml:space="preserve">2</w:t>
+      </w:r>
+      <w:r>
+        <w:t xml:space="preserve"> </w:t>
+      </w:r>
+      <w:r>
+        <w:t xml:space="preserve">＋ Add field ·</w:t>
+      </w:r>
+      <w:r>
+        <w:t xml:space="preserve"> </w:t>
+      </w:r>
+      <w:r>
+        <w:rPr>
+          <w:bCs/>
+          <w:b/>
+        </w:rPr>
+        <w:t xml:space="preserve">3</w:t>
+      </w:r>
+      <w:r>
+        <w:t xml:space="preserve"> </w:t>
+      </w:r>
+      <w:r>
+        <w:t xml:space="preserve">Columns ▾ ·</w:t>
+      </w:r>
+      <w:r>
+        <w:t xml:space="preserve"> </w:t>
+      </w:r>
+      <w:r>
+        <w:rPr>
+          <w:bCs/>
+          <w:b/>
+        </w:rPr>
+        <w:t xml:space="preserve">4</w:t>
+      </w:r>
+      <w:r>
+        <w:t xml:space="preserve"> </w:t>
+      </w:r>
+      <w:r>
+        <w:t xml:space="preserve">Column filter ·</w:t>
+      </w:r>
+      <w:r>
+        <w:t xml:space="preserve"> </w:t>
+      </w:r>
+      <w:r>
+        <w:rPr>
+          <w:bCs/>
+          <w:b/>
+        </w:rPr>
+        <w:t xml:space="preserve">5</w:t>
+      </w:r>
+      <w:r>
+        <w:t xml:space="preserve"> </w:t>
+      </w:r>
+      <w:r>
+        <w:t xml:space="preserve">✎ Table details</w:t>
+      </w:r>
+    </w:p>
+    <w:bookmarkEnd w:id="48"/>
+    <w:bookmarkStart w:id="52" w:name="editing-values"/>
     <w:p>
       <w:pPr>
         <w:pStyle w:val="Heading2"/>
@@ -2767,8 +3471,63 @@
         <w:t xml:space="preserve">(or ↑ ↓) move to the next and previous row.</w:t>
       </w:r>
     </w:p>
-    <w:bookmarkEnd w:id="28"/>
-    <w:bookmarkStart w:id="29" w:name="adding-fields-and-relationships"/>
+    <w:p>
+      <w:pPr>
+        <w:pStyle w:val="CaptionedFigure"/>
+      </w:pPr>
+      <w:r>
+        <w:drawing>
+          <wp:inline>
+            <wp:extent cx="5334000" cy="1820060"/>
+            <wp:effectExtent b="0" l="0" r="0" t="0"/>
+            <wp:docPr descr="Editing a cell: a dropdown for Required Level" title="" id="50" name="Picture"/>
+            <a:graphic>
+              <a:graphicData uri="http://schemas.openxmlformats.org/drawingml/2006/picture">
+                <pic:pic>
+                  <pic:nvPicPr>
+                    <pic:cNvPr descr="images/07-edit.png" id="51" name="Picture"/>
+                    <pic:cNvPicPr>
+                      <a:picLocks noChangeArrowheads="1" noChangeAspect="1"/>
+                    </pic:cNvPicPr>
+                  </pic:nvPicPr>
+                  <pic:blipFill>
+                    <a:blip r:embed="rId49"/>
+                    <a:stretch>
+                      <a:fillRect/>
+                    </a:stretch>
+                  </pic:blipFill>
+                  <pic:spPr bwMode="auto">
+                    <a:xfrm>
+                      <a:off x="0" y="0"/>
+                      <a:ext cx="5334000" cy="1820060"/>
+                    </a:xfrm>
+                    <a:prstGeom prst="rect">
+                      <a:avLst/>
+                    </a:prstGeom>
+                    <a:noFill/>
+                    <a:ln w="9525">
+                      <a:noFill/>
+                      <a:headEnd/>
+                      <a:tailEnd/>
+                    </a:ln>
+                  </pic:spPr>
+                </pic:pic>
+              </a:graphicData>
+            </a:graphic>
+          </wp:inline>
+        </w:drawing>
+      </w:r>
+    </w:p>
+    <w:p>
+      <w:pPr>
+        <w:pStyle w:val="ImageCaption"/>
+      </w:pPr>
+      <w:r>
+        <w:t xml:space="preserve">Editing a cell: a dropdown for Required Level</w:t>
+      </w:r>
+    </w:p>
+    <w:bookmarkEnd w:id="52"/>
+    <w:bookmarkStart w:id="56" w:name="adding-fields-and-relationships"/>
     <w:p>
       <w:pPr>
         <w:pStyle w:val="Heading2"/>
@@ -3081,7 +3840,128 @@
     </w:p>
     <w:p>
       <w:pPr>
-        <w:pStyle w:val="FirstParagraph"/>
+        <w:pStyle w:val="CaptionedFigure"/>
+      </w:pPr>
+      <w:r>
+        <w:drawing>
+          <wp:inline>
+            <wp:extent cx="4828032" cy="2696870"/>
+            <wp:effectExtent b="0" l="0" r="0" t="0"/>
+            <wp:docPr descr="The Add field dialog" title="" id="54" name="Picture"/>
+            <a:graphic>
+              <a:graphicData uri="http://schemas.openxmlformats.org/drawingml/2006/picture">
+                <pic:pic>
+                  <pic:nvPicPr>
+                    <pic:cNvPr descr="images/09-addfield.png" id="55" name="Picture"/>
+                    <pic:cNvPicPr>
+                      <a:picLocks noChangeArrowheads="1" noChangeAspect="1"/>
+                    </pic:cNvPicPr>
+                  </pic:nvPicPr>
+                  <pic:blipFill>
+                    <a:blip r:embed="rId53"/>
+                    <a:stretch>
+                      <a:fillRect/>
+                    </a:stretch>
+                  </pic:blipFill>
+                  <pic:spPr bwMode="auto">
+                    <a:xfrm>
+                      <a:off x="0" y="0"/>
+                      <a:ext cx="4828032" cy="2696870"/>
+                    </a:xfrm>
+                    <a:prstGeom prst="rect">
+                      <a:avLst/>
+                    </a:prstGeom>
+                    <a:noFill/>
+                    <a:ln w="9525">
+                      <a:noFill/>
+                      <a:headEnd/>
+                      <a:tailEnd/>
+                    </a:ln>
+                  </pic:spPr>
+                </pic:pic>
+              </a:graphicData>
+            </a:graphic>
+          </wp:inline>
+        </w:drawing>
+      </w:r>
+    </w:p>
+    <w:p>
+      <w:pPr>
+        <w:pStyle w:val="ImageCaption"/>
+      </w:pPr>
+      <w:r>
+        <w:t xml:space="preserve">The Add field dialog</w:t>
+      </w:r>
+    </w:p>
+    <w:p>
+      <w:pPr>
+        <w:pStyle w:val="BodyText"/>
+      </w:pPr>
+      <w:r>
+        <w:rPr>
+          <w:bCs/>
+          <w:b/>
+        </w:rPr>
+        <w:t xml:space="preserve">1</w:t>
+      </w:r>
+      <w:r>
+        <w:t xml:space="preserve"> </w:t>
+      </w:r>
+      <w:r>
+        <w:t xml:space="preserve">A field or an N:N relationship ·</w:t>
+      </w:r>
+      <w:r>
+        <w:t xml:space="preserve"> </w:t>
+      </w:r>
+      <w:r>
+        <w:rPr>
+          <w:bCs/>
+          <w:b/>
+        </w:rPr>
+        <w:t xml:space="preserve">2</w:t>
+      </w:r>
+      <w:r>
+        <w:t xml:space="preserve"> </w:t>
+      </w:r>
+      <w:r>
+        <w:t xml:space="preserve">Display name (the names follow it) ·</w:t>
+      </w:r>
+      <w:r>
+        <w:t xml:space="preserve"> </w:t>
+      </w:r>
+      <w:r>
+        <w:rPr>
+          <w:bCs/>
+          <w:b/>
+        </w:rPr>
+        <w:t xml:space="preserve">3</w:t>
+      </w:r>
+      <w:r>
+        <w:t xml:space="preserve"> </w:t>
+      </w:r>
+      <w:r>
+        <w:t xml:space="preserve">Field type ·</w:t>
+      </w:r>
+      <w:r>
+        <w:t xml:space="preserve"> </w:t>
+      </w:r>
+      <w:r>
+        <w:rPr>
+          <w:bCs/>
+          <w:b/>
+        </w:rPr>
+        <w:t xml:space="preserve">4</w:t>
+      </w:r>
+      <w:r>
+        <w:t xml:space="preserve"> </w:t>
+      </w:r>
+      <w:r>
+        <w:t xml:space="preserve">Add</w:t>
+      </w:r>
+    </w:p>
+    <w:p>
+      <w:pPr>
+        <w:pStyle w:val="BodyText"/>
       </w:pPr>
       <w:r>
         <w:t xml:space="preserve">A name already in the table is refused. To remove an added row, click</w:t>
@@ -3151,8 +4031,8 @@
         <w:t xml:space="preserve">adds a blank row.</w:t>
       </w:r>
     </w:p>
-    <w:bookmarkEnd w:id="29"/>
-    <w:bookmarkStart w:id="30" w:name="X8f6e01d66b0ce2e5aaa6ec04719c75900d03161"/>
+    <w:bookmarkEnd w:id="56"/>
+    <w:bookmarkStart w:id="60" w:name="X8f6e01d66b0ce2e5aaa6ec04719c75900d03161"/>
     <w:p>
       <w:pPr>
         <w:pStyle w:val="Heading2"/>
@@ -3346,109 +4226,456 @@
     </w:p>
     <w:p>
       <w:pPr>
+        <w:pStyle w:val="CaptionedFigure"/>
+      </w:pPr>
+      <w:r>
+        <w:drawing>
+          <wp:inline>
+            <wp:extent cx="3264407" cy="2830777"/>
+            <wp:effectExtent b="0" l="0" r="0" t="0"/>
+            <wp:docPr descr="A field’s panel" title="" id="58" name="Picture"/>
+            <a:graphic>
+              <a:graphicData uri="http://schemas.openxmlformats.org/drawingml/2006/picture">
+                <pic:pic>
+                  <pic:nvPicPr>
+                    <pic:cNvPr descr="images/08-keys.png" id="59" name="Picture"/>
+                    <pic:cNvPicPr>
+                      <a:picLocks noChangeArrowheads="1" noChangeAspect="1"/>
+                    </pic:cNvPicPr>
+                  </pic:nvPicPr>
+                  <pic:blipFill>
+                    <a:blip r:embed="rId57"/>
+                    <a:stretch>
+                      <a:fillRect/>
+                    </a:stretch>
+                  </pic:blipFill>
+                  <pic:spPr bwMode="auto">
+                    <a:xfrm>
+                      <a:off x="0" y="0"/>
+                      <a:ext cx="3264407" cy="2830777"/>
+                    </a:xfrm>
+                    <a:prstGeom prst="rect">
+                      <a:avLst/>
+                    </a:prstGeom>
+                    <a:noFill/>
+                    <a:ln w="9525">
+                      <a:noFill/>
+                      <a:headEnd/>
+                      <a:tailEnd/>
+                    </a:ln>
+                  </pic:spPr>
+                </pic:pic>
+              </a:graphicData>
+            </a:graphic>
+          </wp:inline>
+        </w:drawing>
+      </w:r>
+    </w:p>
+    <w:p>
+      <w:pPr>
+        <w:pStyle w:val="ImageCaption"/>
+      </w:pPr>
+      <w:r>
+        <w:t xml:space="preserve">A field’s panel</w:t>
+      </w:r>
+    </w:p>
+    <w:p>
+      <w:pPr>
+        <w:pStyle w:val="BodyText"/>
+      </w:pPr>
+      <w:r>
+        <w:rPr>
+          <w:bCs/>
+          <w:b/>
+        </w:rPr>
+        <w:t xml:space="preserve">1</w:t>
+      </w:r>
+      <w:r>
+        <w:t xml:space="preserve"> </w:t>
+      </w:r>
+      <w:r>
+        <w:t xml:space="preserve">Set as primary key ·</w:t>
+      </w:r>
+      <w:r>
+        <w:t xml:space="preserve"> </w:t>
+      </w:r>
+      <w:r>
+        <w:rPr>
+          <w:bCs/>
+          <w:b/>
+        </w:rPr>
+        <w:t xml:space="preserve">2</w:t>
+      </w:r>
+      <w:r>
+        <w:t xml:space="preserve"> </w:t>
+      </w:r>
+      <w:r>
+        <w:t xml:space="preserve">Set as primary name ·</w:t>
+      </w:r>
+      <w:r>
+        <w:t xml:space="preserve"> </w:t>
+      </w:r>
+      <w:r>
+        <w:rPr>
+          <w:bCs/>
+          <w:b/>
+        </w:rPr>
+        <w:t xml:space="preserve">3</w:t>
+      </w:r>
+      <w:r>
+        <w:t xml:space="preserve"> </w:t>
+      </w:r>
+      <w:r>
+        <w:t xml:space="preserve">Click a value to edit it</w:t>
+      </w:r>
+    </w:p>
+    <w:p>
+      <w:pPr>
+        <w:pStyle w:val="BodyText"/>
+      </w:pPr>
+      <w:r>
+        <w:t xml:space="preserve">Dataverse primary keys are always unique identifiers (GUIDs) created with the table. Marking a text or number field as the key is flagged in Checks; to keep another field’s values unique, use an alternate key in Dataverse.</w:t>
+      </w:r>
+    </w:p>
+    <w:bookmarkEnd w:id="60"/>
+    <w:bookmarkStart w:id="64" w:name="reviewing-and-undoing-your-changes"/>
+    <w:p>
+      <w:pPr>
+        <w:pStyle w:val="Heading2"/>
+      </w:pPr>
+      <w:r>
+        <w:t xml:space="preserve">Reviewing and undoing your changes</w:t>
+      </w:r>
+    </w:p>
+    <w:p>
+      <w:pPr>
         <w:pStyle w:val="FirstParagraph"/>
       </w:pPr>
       <w:r>
-        <w:t xml:space="preserve">Dataverse primary keys are always unique identifiers (GUIDs) created with the table. Marking a text or number field as the key is flagged in Checks; to keep another field’s values unique, use an alternate key in Dataverse.</w:t>
-      </w:r>
-    </w:p>
-    <w:bookmarkEnd w:id="30"/>
-    <w:bookmarkStart w:id="31" w:name="reviewing-and-undoing-your-changes"/>
+        <w:rPr>
+          <w:bCs/>
+          <w:b/>
+        </w:rPr>
+        <w:t xml:space="preserve">Changes</w:t>
+      </w:r>
+      <w:r>
+        <w:t xml:space="preserve"> </w:t>
+      </w:r>
+      <w:r>
+        <w:t xml:space="preserve">in the header lists rows you added, table details you changed, and every cell edit as original against new, each with</w:t>
+      </w:r>
+      <w:r>
+        <w:t xml:space="preserve"> </w:t>
+      </w:r>
+      <w:r>
+        <w:rPr>
+          <w:bCs/>
+          <w:b/>
+        </w:rPr>
+        <w:t xml:space="preserve">go</w:t>
+      </w:r>
+      <w:r>
+        <w:t xml:space="preserve"> </w:t>
+      </w:r>
+      <w:r>
+        <w:t xml:space="preserve">and</w:t>
+      </w:r>
+      <w:r>
+        <w:t xml:space="preserve"> </w:t>
+      </w:r>
+      <w:r>
+        <w:rPr>
+          <w:bCs/>
+          <w:b/>
+        </w:rPr>
+        <w:t xml:space="preserve">revert</w:t>
+      </w:r>
+      <w:r>
+        <w:t xml:space="preserve">.</w:t>
+      </w:r>
+      <w:r>
+        <w:t xml:space="preserve"> </w:t>
+      </w:r>
+      <w:r>
+        <w:rPr>
+          <w:bCs/>
+          <w:b/>
+        </w:rPr>
+        <w:t xml:space="preserve">Revert all</w:t>
+      </w:r>
+      <w:r>
+        <w:t xml:space="preserve"> </w:t>
+      </w:r>
+      <w:r>
+        <w:t xml:space="preserve">undoes everything;</w:t>
+      </w:r>
+      <w:r>
+        <w:t xml:space="preserve"> </w:t>
+      </w:r>
+      <w:r>
+        <w:rPr>
+          <w:bCs/>
+          <w:b/>
+        </w:rPr>
+        <w:t xml:space="preserve">Export log (CSV)</w:t>
+      </w:r>
+      <w:r>
+        <w:t xml:space="preserve"> </w:t>
+      </w:r>
+      <w:r>
+        <w:t xml:space="preserve">downloads the list.</w:t>
+      </w:r>
+    </w:p>
+    <w:p>
+      <w:pPr>
+        <w:pStyle w:val="CaptionedFigure"/>
+      </w:pPr>
+      <w:r>
+        <w:drawing>
+          <wp:inline>
+            <wp:extent cx="3264407" cy="1851455"/>
+            <wp:effectExtent b="0" l="0" r="0" t="0"/>
+            <wp:docPr descr="The Changes panel" title="" id="62" name="Picture"/>
+            <a:graphic>
+              <a:graphicData uri="http://schemas.openxmlformats.org/drawingml/2006/picture">
+                <pic:pic>
+                  <pic:nvPicPr>
+                    <pic:cNvPr descr="images/10-changes.png" id="63" name="Picture"/>
+                    <pic:cNvPicPr>
+                      <a:picLocks noChangeArrowheads="1" noChangeAspect="1"/>
+                    </pic:cNvPicPr>
+                  </pic:nvPicPr>
+                  <pic:blipFill>
+                    <a:blip r:embed="rId61"/>
+                    <a:stretch>
+                      <a:fillRect/>
+                    </a:stretch>
+                  </pic:blipFill>
+                  <pic:spPr bwMode="auto">
+                    <a:xfrm>
+                      <a:off x="0" y="0"/>
+                      <a:ext cx="3264407" cy="1851455"/>
+                    </a:xfrm>
+                    <a:prstGeom prst="rect">
+                      <a:avLst/>
+                    </a:prstGeom>
+                    <a:noFill/>
+                    <a:ln w="9525">
+                      <a:noFill/>
+                      <a:headEnd/>
+                      <a:tailEnd/>
+                    </a:ln>
+                  </pic:spPr>
+                </pic:pic>
+              </a:graphicData>
+            </a:graphic>
+          </wp:inline>
+        </w:drawing>
+      </w:r>
+    </w:p>
+    <w:p>
+      <w:pPr>
+        <w:pStyle w:val="ImageCaption"/>
+      </w:pPr>
+      <w:r>
+        <w:t xml:space="preserve">The Changes panel</w:t>
+      </w:r>
+    </w:p>
+    <w:p>
+      <w:pPr>
+        <w:pStyle w:val="BodyText"/>
+      </w:pPr>
+      <w:r>
+        <w:rPr>
+          <w:bCs/>
+          <w:b/>
+        </w:rPr>
+        <w:t xml:space="preserve">1</w:t>
+      </w:r>
+      <w:r>
+        <w:t xml:space="preserve"> </w:t>
+      </w:r>
+      <w:r>
+        <w:t xml:space="preserve">Changes ·</w:t>
+      </w:r>
+      <w:r>
+        <w:t xml:space="preserve"> </w:t>
+      </w:r>
+      <w:r>
+        <w:rPr>
+          <w:bCs/>
+          <w:b/>
+        </w:rPr>
+        <w:t xml:space="preserve">2</w:t>
+      </w:r>
+      <w:r>
+        <w:t xml:space="preserve"> </w:t>
+      </w:r>
+      <w:r>
+        <w:t xml:space="preserve">Remove an added row ·</w:t>
+      </w:r>
+      <w:r>
+        <w:t xml:space="preserve"> </w:t>
+      </w:r>
+      <w:r>
+        <w:rPr>
+          <w:bCs/>
+          <w:b/>
+        </w:rPr>
+        <w:t xml:space="preserve">3</w:t>
+      </w:r>
+      <w:r>
+        <w:t xml:space="preserve"> </w:t>
+      </w:r>
+      <w:r>
+        <w:t xml:space="preserve">Revert one edit ·</w:t>
+      </w:r>
+      <w:r>
+        <w:t xml:space="preserve"> </w:t>
+      </w:r>
+      <w:r>
+        <w:rPr>
+          <w:bCs/>
+          <w:b/>
+        </w:rPr>
+        <w:t xml:space="preserve">4</w:t>
+      </w:r>
+      <w:r>
+        <w:t xml:space="preserve"> </w:t>
+      </w:r>
+      <w:r>
+        <w:t xml:space="preserve">Revert all</w:t>
+      </w:r>
+    </w:p>
+    <w:bookmarkEnd w:id="64"/>
+    <w:bookmarkStart w:id="71" w:name="saving-and-exporting"/>
     <w:p>
       <w:pPr>
         <w:pStyle w:val="Heading2"/>
       </w:pPr>
       <w:r>
-        <w:t xml:space="preserve">Reviewing and undoing your changes</w:t>
-      </w:r>
-    </w:p>
-    <w:p>
-      <w:pPr>
-        <w:pStyle w:val="FirstParagraph"/>
-      </w:pPr>
-      <w:r>
-        <w:rPr>
-          <w:bCs/>
-          <w:b/>
-        </w:rPr>
-        <w:t xml:space="preserve">Changes</w:t>
-      </w:r>
-      <w:r>
-        <w:t xml:space="preserve"> </w:t>
-      </w:r>
-      <w:r>
-        <w:t xml:space="preserve">in the header lists rows you added, table details you changed, and every cell edit as original against new, each with</w:t>
-      </w:r>
-      <w:r>
-        <w:t xml:space="preserve"> </w:t>
-      </w:r>
-      <w:r>
-        <w:rPr>
-          <w:bCs/>
-          <w:b/>
-        </w:rPr>
-        <w:t xml:space="preserve">go</w:t>
-      </w:r>
-      <w:r>
-        <w:t xml:space="preserve"> </w:t>
-      </w:r>
-      <w:r>
-        <w:t xml:space="preserve">and</w:t>
-      </w:r>
-      <w:r>
-        <w:t xml:space="preserve"> </w:t>
-      </w:r>
-      <w:r>
-        <w:rPr>
-          <w:bCs/>
-          <w:b/>
-        </w:rPr>
-        <w:t xml:space="preserve">revert</w:t>
-      </w:r>
-      <w:r>
-        <w:t xml:space="preserve">.</w:t>
-      </w:r>
-      <w:r>
-        <w:t xml:space="preserve"> </w:t>
-      </w:r>
-      <w:r>
-        <w:rPr>
-          <w:bCs/>
-          <w:b/>
-        </w:rPr>
-        <w:t xml:space="preserve">Revert all</w:t>
-      </w:r>
-      <w:r>
-        <w:t xml:space="preserve"> </w:t>
-      </w:r>
-      <w:r>
-        <w:t xml:space="preserve">undoes everything;</w:t>
-      </w:r>
-      <w:r>
-        <w:t xml:space="preserve"> </w:t>
-      </w:r>
-      <w:r>
-        <w:rPr>
-          <w:bCs/>
-          <w:b/>
-        </w:rPr>
-        <w:t xml:space="preserve">Export log (CSV)</w:t>
-      </w:r>
-      <w:r>
-        <w:t xml:space="preserve"> </w:t>
-      </w:r>
-      <w:r>
-        <w:t xml:space="preserve">downloads the list.</w:t>
-      </w:r>
-    </w:p>
-    <w:bookmarkEnd w:id="31"/>
-    <w:bookmarkStart w:id="32" w:name="saving-and-exporting"/>
-    <w:p>
-      <w:pPr>
-        <w:pStyle w:val="Heading2"/>
-      </w:pPr>
-      <w:r>
         <w:t xml:space="preserve">Saving and exporting</w:t>
+      </w:r>
+    </w:p>
+    <w:p>
+      <w:pPr>
+        <w:pStyle w:val="CaptionedFigure"/>
+      </w:pPr>
+      <w:r>
+        <w:drawing>
+          <wp:inline>
+            <wp:extent cx="2807208" cy="3393060"/>
+            <wp:effectExtent b="0" l="0" r="0" t="0"/>
+            <wp:docPr descr="The Export menu" title="" id="66" name="Picture"/>
+            <a:graphic>
+              <a:graphicData uri="http://schemas.openxmlformats.org/drawingml/2006/picture">
+                <pic:pic>
+                  <pic:nvPicPr>
+                    <pic:cNvPr descr="images/11-export.png" id="67" name="Picture"/>
+                    <pic:cNvPicPr>
+                      <a:picLocks noChangeArrowheads="1" noChangeAspect="1"/>
+                    </pic:cNvPicPr>
+                  </pic:nvPicPr>
+                  <pic:blipFill>
+                    <a:blip r:embed="rId65"/>
+                    <a:stretch>
+                      <a:fillRect/>
+                    </a:stretch>
+                  </pic:blipFill>
+                  <pic:spPr bwMode="auto">
+                    <a:xfrm>
+                      <a:off x="0" y="0"/>
+                      <a:ext cx="2807208" cy="3393060"/>
+                    </a:xfrm>
+                    <a:prstGeom prst="rect">
+                      <a:avLst/>
+                    </a:prstGeom>
+                    <a:noFill/>
+                    <a:ln w="9525">
+                      <a:noFill/>
+                      <a:headEnd/>
+                      <a:tailEnd/>
+                    </a:ln>
+                  </pic:spPr>
+                </pic:pic>
+              </a:graphicData>
+            </a:graphic>
+          </wp:inline>
+        </w:drawing>
+      </w:r>
+    </w:p>
+    <w:p>
+      <w:pPr>
+        <w:pStyle w:val="ImageCaption"/>
+      </w:pPr>
+      <w:r>
+        <w:t xml:space="preserve">The Export menu</w:t>
+      </w:r>
+    </w:p>
+    <w:p>
+      <w:pPr>
+        <w:pStyle w:val="BodyText"/>
+      </w:pPr>
+      <w:r>
+        <w:rPr>
+          <w:bCs/>
+          <w:b/>
+        </w:rPr>
+        <w:t xml:space="preserve">1</w:t>
+      </w:r>
+      <w:r>
+        <w:t xml:space="preserve"> </w:t>
+      </w:r>
+      <w:r>
+        <w:t xml:space="preserve">Export ▾ ·</w:t>
+      </w:r>
+      <w:r>
+        <w:t xml:space="preserve"> </w:t>
+      </w:r>
+      <w:r>
+        <w:rPr>
+          <w:bCs/>
+          <w:b/>
+        </w:rPr>
+        <w:t xml:space="preserve">2</w:t>
+      </w:r>
+      <w:r>
+        <w:t xml:space="preserve"> </w:t>
+      </w:r>
+      <w:r>
+        <w:t xml:space="preserve">Download an updated copy ·</w:t>
+      </w:r>
+      <w:r>
+        <w:t xml:space="preserve"> </w:t>
+      </w:r>
+      <w:r>
+        <w:rPr>
+          <w:bCs/>
+          <w:b/>
+        </w:rPr>
+        <w:t xml:space="preserve">3</w:t>
+      </w:r>
+      <w:r>
+        <w:t xml:space="preserve"> </w:t>
+      </w:r>
+      <w:r>
+        <w:t xml:space="preserve">New version in template format ·</w:t>
+      </w:r>
+      <w:r>
+        <w:t xml:space="preserve"> </w:t>
+      </w:r>
+      <w:r>
+        <w:rPr>
+          <w:bCs/>
+          <w:b/>
+        </w:rPr>
+        <w:t xml:space="preserve">4</w:t>
+      </w:r>
+      <w:r>
+        <w:t xml:space="preserve"> </w:t>
+      </w:r>
+      <w:r>
+        <w:t xml:space="preserve">Dataverse solution</w:t>
       </w:r>
     </w:p>
     <w:tbl>
@@ -3794,8 +5021,97 @@
         <w:t xml:space="preserve">.</w:t>
       </w:r>
     </w:p>
-    <w:bookmarkEnd w:id="32"/>
-    <w:bookmarkStart w:id="37" w:name="updating-the-template"/>
+    <w:p>
+      <w:pPr>
+        <w:pStyle w:val="CaptionedFigure"/>
+      </w:pPr>
+      <w:r>
+        <w:drawing>
+          <wp:inline>
+            <wp:extent cx="2880360" cy="1532937"/>
+            <wp:effectExtent b="0" l="0" r="0" t="0"/>
+            <wp:docPr descr="Naming the file" title="" id="69" name="Picture"/>
+            <a:graphic>
+              <a:graphicData uri="http://schemas.openxmlformats.org/drawingml/2006/picture">
+                <pic:pic>
+                  <pic:nvPicPr>
+                    <pic:cNvPr descr="images/12-filename.png" id="70" name="Picture"/>
+                    <pic:cNvPicPr>
+                      <a:picLocks noChangeArrowheads="1" noChangeAspect="1"/>
+                    </pic:cNvPicPr>
+                  </pic:nvPicPr>
+                  <pic:blipFill>
+                    <a:blip r:embed="rId68"/>
+                    <a:stretch>
+                      <a:fillRect/>
+                    </a:stretch>
+                  </pic:blipFill>
+                  <pic:spPr bwMode="auto">
+                    <a:xfrm>
+                      <a:off x="0" y="0"/>
+                      <a:ext cx="2880360" cy="1532937"/>
+                    </a:xfrm>
+                    <a:prstGeom prst="rect">
+                      <a:avLst/>
+                    </a:prstGeom>
+                    <a:noFill/>
+                    <a:ln w="9525">
+                      <a:noFill/>
+                      <a:headEnd/>
+                      <a:tailEnd/>
+                    </a:ln>
+                  </pic:spPr>
+                </pic:pic>
+              </a:graphicData>
+            </a:graphic>
+          </wp:inline>
+        </w:drawing>
+      </w:r>
+    </w:p>
+    <w:p>
+      <w:pPr>
+        <w:pStyle w:val="ImageCaption"/>
+      </w:pPr>
+      <w:r>
+        <w:t xml:space="preserve">Naming the file</w:t>
+      </w:r>
+    </w:p>
+    <w:p>
+      <w:pPr>
+        <w:pStyle w:val="BodyText"/>
+      </w:pPr>
+      <w:r>
+        <w:rPr>
+          <w:bCs/>
+          <w:b/>
+        </w:rPr>
+        <w:t xml:space="preserve">1</w:t>
+      </w:r>
+      <w:r>
+        <w:t xml:space="preserve"> </w:t>
+      </w:r>
+      <w:r>
+        <w:t xml:space="preserve">Type the name ·</w:t>
+      </w:r>
+      <w:r>
+        <w:t xml:space="preserve"> </w:t>
+      </w:r>
+      <w:r>
+        <w:rPr>
+          <w:bCs/>
+          <w:b/>
+        </w:rPr>
+        <w:t xml:space="preserve">2</w:t>
+      </w:r>
+      <w:r>
+        <w:t xml:space="preserve"> </w:t>
+      </w:r>
+      <w:r>
+        <w:t xml:space="preserve">Download</w:t>
+      </w:r>
+    </w:p>
+    <w:bookmarkEnd w:id="71"/>
+    <w:bookmarkStart w:id="82" w:name="updating-the-template"/>
     <w:p>
       <w:pPr>
         <w:pStyle w:val="Heading2"/>
@@ -3825,7 +5141,7 @@
         <w:t xml:space="preserve">. The page has the current FormusPro template built in; you can replace it with your own.</w:t>
       </w:r>
     </w:p>
-    <w:bookmarkStart w:id="33" w:name="checking-a-workbook-against-the-template"/>
+    <w:bookmarkStart w:id="75" w:name="checking-a-workbook-against-the-template"/>
     <w:p>
       <w:pPr>
         <w:pStyle w:val="Heading3"/>
@@ -3836,7 +5152,112 @@
     </w:p>
     <w:p>
       <w:pPr>
-        <w:pStyle w:val="FirstParagraph"/>
+        <w:pStyle w:val="CaptionedFigure"/>
+      </w:pPr>
+      <w:r>
+        <w:drawing>
+          <wp:inline>
+            <wp:extent cx="1755648" cy="1380134"/>
+            <wp:effectExtent b="0" l="0" r="0" t="0"/>
+            <wp:docPr descr="The More menu" title="" id="73" name="Picture"/>
+            <a:graphic>
+              <a:graphicData uri="http://schemas.openxmlformats.org/drawingml/2006/picture">
+                <pic:pic>
+                  <pic:nvPicPr>
+                    <pic:cNvPr descr="images/14-more.png" id="74" name="Picture"/>
+                    <pic:cNvPicPr>
+                      <a:picLocks noChangeArrowheads="1" noChangeAspect="1"/>
+                    </pic:cNvPicPr>
+                  </pic:nvPicPr>
+                  <pic:blipFill>
+                    <a:blip r:embed="rId72"/>
+                    <a:stretch>
+                      <a:fillRect/>
+                    </a:stretch>
+                  </pic:blipFill>
+                  <pic:spPr bwMode="auto">
+                    <a:xfrm>
+                      <a:off x="0" y="0"/>
+                      <a:ext cx="1755648" cy="1380134"/>
+                    </a:xfrm>
+                    <a:prstGeom prst="rect">
+                      <a:avLst/>
+                    </a:prstGeom>
+                    <a:noFill/>
+                    <a:ln w="9525">
+                      <a:noFill/>
+                      <a:headEnd/>
+                      <a:tailEnd/>
+                    </a:ln>
+                  </pic:spPr>
+                </pic:pic>
+              </a:graphicData>
+            </a:graphic>
+          </wp:inline>
+        </w:drawing>
+      </w:r>
+    </w:p>
+    <w:p>
+      <w:pPr>
+        <w:pStyle w:val="ImageCaption"/>
+      </w:pPr>
+      <w:r>
+        <w:t xml:space="preserve">The More menu</w:t>
+      </w:r>
+    </w:p>
+    <w:p>
+      <w:pPr>
+        <w:pStyle w:val="BodyText"/>
+      </w:pPr>
+      <w:r>
+        <w:rPr>
+          <w:bCs/>
+          <w:b/>
+        </w:rPr>
+        <w:t xml:space="preserve">1</w:t>
+      </w:r>
+      <w:r>
+        <w:t xml:space="preserve"> </w:t>
+      </w:r>
+      <w:r>
+        <w:t xml:space="preserve">More ▾ ·</w:t>
+      </w:r>
+      <w:r>
+        <w:t xml:space="preserve"> </w:t>
+      </w:r>
+      <w:r>
+        <w:rPr>
+          <w:bCs/>
+          <w:b/>
+        </w:rPr>
+        <w:t xml:space="preserve">2</w:t>
+      </w:r>
+      <w:r>
+        <w:t xml:space="preserve"> </w:t>
+      </w:r>
+      <w:r>
+        <w:t xml:space="preserve">Dataverse check ·</w:t>
+      </w:r>
+      <w:r>
+        <w:t xml:space="preserve"> </w:t>
+      </w:r>
+      <w:r>
+        <w:rPr>
+          <w:bCs/>
+          <w:b/>
+        </w:rPr>
+        <w:t xml:space="preserve">3</w:t>
+      </w:r>
+      <w:r>
+        <w:t xml:space="preserve"> </w:t>
+      </w:r>
+      <w:r>
+        <w:t xml:space="preserve">Template</w:t>
+      </w:r>
+    </w:p>
+    <w:p>
+      <w:pPr>
+        <w:pStyle w:val="BodyText"/>
       </w:pPr>
       <w:r>
         <w:t xml:space="preserve">Click</w:t>
@@ -3849,17 +5270,14 @@
           <w:bCs/>
           <w:b/>
         </w:rPr>
-        <w:t xml:space="preserve">Template</w:t>
-      </w:r>
-      <w:r>
-        <w:t xml:space="preserve"> </w:t>
-      </w:r>
-      <w:r>
-        <w:t xml:space="preserve">in the header. The panel lists tables not in the template, extra columns the workbook has, and columns or details it is missing. A pink count on the button shows how many tables differ.</w:t>
-      </w:r>
-    </w:p>
-    <w:bookmarkEnd w:id="33"/>
-    <w:bookmarkStart w:id="34" w:name="bringing-an-older-workbook-up-to-date"/>
+        <w:t xml:space="preserve">More ▾ → Template</w:t>
+      </w:r>
+      <w:r>
+        <w:t xml:space="preserve">. The panel lists tables not in the template, extra columns the workbook has, and columns or details it is missing. A pink count on the button shows how many tables differ.</w:t>
+      </w:r>
+    </w:p>
+    <w:bookmarkEnd w:id="75"/>
+    <w:bookmarkStart w:id="76" w:name="bringing-an-older-workbook-up-to-date"/>
     <w:p>
       <w:pPr>
         <w:pStyle w:val="Heading3"/>
@@ -3971,8 +5389,8 @@
         <w:t xml:space="preserve">: the whole workbook rebuilt in the current template layout, every column and detail included.</w:t>
       </w:r>
     </w:p>
-    <w:bookmarkEnd w:id="34"/>
-    <w:bookmarkStart w:id="35" w:name="using-your-own-template"/>
+    <w:bookmarkEnd w:id="76"/>
+    <w:bookmarkStart w:id="80" w:name="using-your-own-template"/>
     <w:p>
       <w:pPr>
         <w:pStyle w:val="Heading3"/>
@@ -3994,7 +5412,7 @@
           <w:bCs/>
           <w:b/>
         </w:rPr>
-        <w:t xml:space="preserve">Template → Download blank template</w:t>
+        <w:t xml:space="preserve">More ▾ → Template → Download blank template</w:t>
       </w:r>
       <w:r>
         <w:t xml:space="preserve"> </w:t>
@@ -4089,8 +5507,113 @@
         <w:t xml:space="preserve">Reopen the workbook (or reload the page) so it picks up the new columns.</w:t>
       </w:r>
     </w:p>
-    <w:bookmarkEnd w:id="35"/>
-    <w:bookmarkStart w:id="36" w:name="what-you-can-change"/>
+    <w:p>
+      <w:pPr>
+        <w:pStyle w:val="CaptionedFigure"/>
+      </w:pPr>
+      <w:r>
+        <w:drawing>
+          <wp:inline>
+            <wp:extent cx="3264407" cy="2621270"/>
+            <wp:effectExtent b="0" l="0" r="0" t="0"/>
+            <wp:docPr descr="The Template panel" title="" id="78" name="Picture"/>
+            <a:graphic>
+              <a:graphicData uri="http://schemas.openxmlformats.org/drawingml/2006/picture">
+                <pic:pic>
+                  <pic:nvPicPr>
+                    <pic:cNvPr descr="images/15-template.png" id="79" name="Picture"/>
+                    <pic:cNvPicPr>
+                      <a:picLocks noChangeArrowheads="1" noChangeAspect="1"/>
+                    </pic:cNvPicPr>
+                  </pic:nvPicPr>
+                  <pic:blipFill>
+                    <a:blip r:embed="rId77"/>
+                    <a:stretch>
+                      <a:fillRect/>
+                    </a:stretch>
+                  </pic:blipFill>
+                  <pic:spPr bwMode="auto">
+                    <a:xfrm>
+                      <a:off x="0" y="0"/>
+                      <a:ext cx="3264407" cy="2621270"/>
+                    </a:xfrm>
+                    <a:prstGeom prst="rect">
+                      <a:avLst/>
+                    </a:prstGeom>
+                    <a:noFill/>
+                    <a:ln w="9525">
+                      <a:noFill/>
+                      <a:headEnd/>
+                      <a:tailEnd/>
+                    </a:ln>
+                  </pic:spPr>
+                </pic:pic>
+              </a:graphicData>
+            </a:graphic>
+          </wp:inline>
+        </w:drawing>
+      </w:r>
+    </w:p>
+    <w:p>
+      <w:pPr>
+        <w:pStyle w:val="ImageCaption"/>
+      </w:pPr>
+      <w:r>
+        <w:t xml:space="preserve">The Template panel</w:t>
+      </w:r>
+    </w:p>
+    <w:p>
+      <w:pPr>
+        <w:pStyle w:val="BodyText"/>
+      </w:pPr>
+      <w:r>
+        <w:rPr>
+          <w:bCs/>
+          <w:b/>
+        </w:rPr>
+        <w:t xml:space="preserve">1</w:t>
+      </w:r>
+      <w:r>
+        <w:t xml:space="preserve"> </w:t>
+      </w:r>
+      <w:r>
+        <w:t xml:space="preserve">Download blank template ·</w:t>
+      </w:r>
+      <w:r>
+        <w:t xml:space="preserve"> </w:t>
+      </w:r>
+      <w:r>
+        <w:rPr>
+          <w:bCs/>
+          <w:b/>
+        </w:rPr>
+        <w:t xml:space="preserve">2</w:t>
+      </w:r>
+      <w:r>
+        <w:t xml:space="preserve"> </w:t>
+      </w:r>
+      <w:r>
+        <w:t xml:space="preserve">Use a different template… ·</w:t>
+      </w:r>
+      <w:r>
+        <w:t xml:space="preserve"> </w:t>
+      </w:r>
+      <w:r>
+        <w:rPr>
+          <w:bCs/>
+          <w:b/>
+        </w:rPr>
+        <w:t xml:space="preserve">3</w:t>
+      </w:r>
+      <w:r>
+        <w:t xml:space="preserve"> </w:t>
+      </w:r>
+      <w:r>
+        <w:t xml:space="preserve">Reset to bundled</w:t>
+      </w:r>
+    </w:p>
+    <w:bookmarkEnd w:id="80"/>
+    <w:bookmarkStart w:id="81" w:name="what-you-can-change"/>
     <w:p>
       <w:pPr>
         <w:pStyle w:val="Heading3"/>
@@ -4324,9 +5847,9 @@
         <w:t xml:space="preserve">A new column needs a code change only if the solution builder or a check should use it.</w:t>
       </w:r>
     </w:p>
-    <w:bookmarkEnd w:id="36"/>
-    <w:bookmarkEnd w:id="37"/>
-    <w:bookmarkStart w:id="38" w:name="comparing-with-dataverse"/>
+    <w:bookmarkEnd w:id="81"/>
+    <w:bookmarkEnd w:id="82"/>
+    <w:bookmarkStart w:id="86" w:name="comparing-with-dataverse"/>
     <w:p>
       <w:pPr>
         <w:pStyle w:val="Heading2"/>
@@ -4368,7 +5891,20 @@
         <w:t xml:space="preserve"> </w:t>
       </w:r>
       <w:r>
-        <w:t xml:space="preserve">on the Overview.</w:t>
+        <w:t xml:space="preserve">on the Overview, or</w:t>
+      </w:r>
+      <w:r>
+        <w:t xml:space="preserve"> </w:t>
+      </w:r>
+      <w:r>
+        <w:rPr>
+          <w:bCs/>
+          <w:b/>
+        </w:rPr>
+        <w:t xml:space="preserve">More ▾ → Dataverse check</w:t>
+      </w:r>
+      <w:r>
+        <w:t xml:space="preserve">.</w:t>
       </w:r>
     </w:p>
     <w:p>
@@ -4521,7 +6057,112 @@
     </w:p>
     <w:p>
       <w:pPr>
-        <w:pStyle w:val="FirstParagraph"/>
+        <w:pStyle w:val="CaptionedFigure"/>
+      </w:pPr>
+      <w:r>
+        <w:drawing>
+          <wp:inline>
+            <wp:extent cx="3264407" cy="2777182"/>
+            <wp:effectExtent b="0" l="0" r="0" t="0"/>
+            <wp:docPr descr="The Dataverse check panel" title="" id="84" name="Picture"/>
+            <a:graphic>
+              <a:graphicData uri="http://schemas.openxmlformats.org/drawingml/2006/picture">
+                <pic:pic>
+                  <pic:nvPicPr>
+                    <pic:cNvPr descr="images/16-dataverse.png" id="85" name="Picture"/>
+                    <pic:cNvPicPr>
+                      <a:picLocks noChangeArrowheads="1" noChangeAspect="1"/>
+                    </pic:cNvPicPr>
+                  </pic:nvPicPr>
+                  <pic:blipFill>
+                    <a:blip r:embed="rId83"/>
+                    <a:stretch>
+                      <a:fillRect/>
+                    </a:stretch>
+                  </pic:blipFill>
+                  <pic:spPr bwMode="auto">
+                    <a:xfrm>
+                      <a:off x="0" y="0"/>
+                      <a:ext cx="3264407" cy="2777182"/>
+                    </a:xfrm>
+                    <a:prstGeom prst="rect">
+                      <a:avLst/>
+                    </a:prstGeom>
+                    <a:noFill/>
+                    <a:ln w="9525">
+                      <a:noFill/>
+                      <a:headEnd/>
+                      <a:tailEnd/>
+                    </a:ln>
+                  </pic:spPr>
+                </pic:pic>
+              </a:graphicData>
+            </a:graphic>
+          </wp:inline>
+        </w:drawing>
+      </w:r>
+    </w:p>
+    <w:p>
+      <w:pPr>
+        <w:pStyle w:val="ImageCaption"/>
+      </w:pPr>
+      <w:r>
+        <w:t xml:space="preserve">The Dataverse check panel</w:t>
+      </w:r>
+    </w:p>
+    <w:p>
+      <w:pPr>
+        <w:pStyle w:val="BodyText"/>
+      </w:pPr>
+      <w:r>
+        <w:rPr>
+          <w:bCs/>
+          <w:b/>
+        </w:rPr>
+        <w:t xml:space="preserve">1</w:t>
+      </w:r>
+      <w:r>
+        <w:t xml:space="preserve"> </w:t>
+      </w:r>
+      <w:r>
+        <w:t xml:space="preserve">Environment URL ·</w:t>
+      </w:r>
+      <w:r>
+        <w:t xml:space="preserve"> </w:t>
+      </w:r>
+      <w:r>
+        <w:rPr>
+          <w:bCs/>
+          <w:b/>
+        </w:rPr>
+        <w:t xml:space="preserve">2</w:t>
+      </w:r>
+      <w:r>
+        <w:t xml:space="preserve"> </w:t>
+      </w:r>
+      <w:r>
+        <w:t xml:space="preserve">Open each link ·</w:t>
+      </w:r>
+      <w:r>
+        <w:t xml:space="preserve"> </w:t>
+      </w:r>
+      <w:r>
+        <w:rPr>
+          <w:bCs/>
+          <w:b/>
+        </w:rPr>
+        <w:t xml:space="preserve">3</w:t>
+      </w:r>
+      <w:r>
+        <w:t xml:space="preserve"> </w:t>
+      </w:r>
+      <w:r>
+        <w:t xml:space="preserve">Choose JSON files…</w:t>
+      </w:r>
+    </w:p>
+    <w:p>
+      <w:pPr>
+        <w:pStyle w:val="BodyText"/>
       </w:pPr>
       <w:r>
         <w:t xml:space="preserve">If Dataverse rejects a link (usually a very long one), use the one-link-per-table list instead. The metadata is kept in the browser for this workbook;</w:t>
@@ -4708,8 +6349,8 @@
         </w:tc>
       </w:tr>
     </w:tbl>
-    <w:bookmarkEnd w:id="38"/>
-    <w:bookmarkStart w:id="39" w:name="generating-a-dataverse-solution"/>
+    <w:bookmarkEnd w:id="86"/>
+    <w:bookmarkStart w:id="90" w:name="generating-a-dataverse-solution"/>
     <w:p>
       <w:pPr>
         <w:pStyle w:val="Heading2"/>
@@ -4824,6 +6465,143 @@
       </w:r>
       <w:r>
         <w:t xml:space="preserve">.</w:t>
+      </w:r>
+    </w:p>
+    <w:p>
+      <w:pPr>
+        <w:pStyle w:val="CaptionedFigure"/>
+      </w:pPr>
+      <w:r>
+        <w:drawing>
+          <wp:inline>
+            <wp:extent cx="4828032" cy="3574694"/>
+            <wp:effectExtent b="0" l="0" r="0" t="0"/>
+            <wp:docPr descr="The Build a Dataverse solution dialog" title="" id="88" name="Picture"/>
+            <a:graphic>
+              <a:graphicData uri="http://schemas.openxmlformats.org/drawingml/2006/picture">
+                <pic:pic>
+                  <pic:nvPicPr>
+                    <pic:cNvPr descr="images/17-solution.png" id="89" name="Picture"/>
+                    <pic:cNvPicPr>
+                      <a:picLocks noChangeArrowheads="1" noChangeAspect="1"/>
+                    </pic:cNvPicPr>
+                  </pic:nvPicPr>
+                  <pic:blipFill>
+                    <a:blip r:embed="rId87"/>
+                    <a:stretch>
+                      <a:fillRect/>
+                    </a:stretch>
+                  </pic:blipFill>
+                  <pic:spPr bwMode="auto">
+                    <a:xfrm>
+                      <a:off x="0" y="0"/>
+                      <a:ext cx="4828032" cy="3574694"/>
+                    </a:xfrm>
+                    <a:prstGeom prst="rect">
+                      <a:avLst/>
+                    </a:prstGeom>
+                    <a:noFill/>
+                    <a:ln w="9525">
+                      <a:noFill/>
+                      <a:headEnd/>
+                      <a:tailEnd/>
+                    </a:ln>
+                  </pic:spPr>
+                </pic:pic>
+              </a:graphicData>
+            </a:graphic>
+          </wp:inline>
+        </w:drawing>
+      </w:r>
+    </w:p>
+    <w:p>
+      <w:pPr>
+        <w:pStyle w:val="ImageCaption"/>
+      </w:pPr>
+      <w:r>
+        <w:t xml:space="preserve">The Build a Dataverse solution dialog</w:t>
+      </w:r>
+    </w:p>
+    <w:p>
+      <w:pPr>
+        <w:pStyle w:val="BodyText"/>
+      </w:pPr>
+      <w:r>
+        <w:rPr>
+          <w:bCs/>
+          <w:b/>
+        </w:rPr>
+        <w:t xml:space="preserve">1</w:t>
+      </w:r>
+      <w:r>
+        <w:t xml:space="preserve"> </w:t>
+      </w:r>
+      <w:r>
+        <w:t xml:space="preserve">Publisher unique name ·</w:t>
+      </w:r>
+      <w:r>
+        <w:t xml:space="preserve"> </w:t>
+      </w:r>
+      <w:r>
+        <w:rPr>
+          <w:bCs/>
+          <w:b/>
+        </w:rPr>
+        <w:t xml:space="preserve">2</w:t>
+      </w:r>
+      <w:r>
+        <w:t xml:space="preserve"> </w:t>
+      </w:r>
+      <w:r>
+        <w:t xml:space="preserve">Prefix ·</w:t>
+      </w:r>
+      <w:r>
+        <w:t xml:space="preserve"> </w:t>
+      </w:r>
+      <w:r>
+        <w:rPr>
+          <w:bCs/>
+          <w:b/>
+        </w:rPr>
+        <w:t xml:space="preserve">3</w:t>
+      </w:r>
+      <w:r>
+        <w:t xml:space="preserve"> </w:t>
+      </w:r>
+      <w:r>
+        <w:t xml:space="preserve">Choice value prefix ·</w:t>
+      </w:r>
+      <w:r>
+        <w:t xml:space="preserve"> </w:t>
+      </w:r>
+      <w:r>
+        <w:rPr>
+          <w:bCs/>
+          <w:b/>
+        </w:rPr>
+        <w:t xml:space="preserve">4</w:t>
+      </w:r>
+      <w:r>
+        <w:t xml:space="preserve"> </w:t>
+      </w:r>
+      <w:r>
+        <w:t xml:space="preserve">Will be built ·</w:t>
+      </w:r>
+      <w:r>
+        <w:t xml:space="preserve"> </w:t>
+      </w:r>
+      <w:r>
+        <w:rPr>
+          <w:bCs/>
+          <w:b/>
+        </w:rPr>
+        <w:t xml:space="preserve">5</w:t>
+      </w:r>
+      <w:r>
+        <w:t xml:space="preserve"> </w:t>
+      </w:r>
+      <w:r>
+        <w:t xml:space="preserve">Generate</w:t>
       </w:r>
     </w:p>
     <w:tbl>
@@ -5349,8 +7127,8 @@
         </w:tc>
       </w:tr>
     </w:tbl>
-    <w:bookmarkEnd w:id="39"/>
-    <w:bookmarkStart w:id="40" w:name="importing-the-solution"/>
+    <w:bookmarkEnd w:id="90"/>
+    <w:bookmarkStart w:id="91" w:name="importing-the-solution"/>
     <w:p>
       <w:pPr>
         <w:pStyle w:val="Heading2"/>
@@ -5719,8 +7497,8 @@
         <w:t xml:space="preserve">downloads the script on its own, to import a solution zip you already have.</w:t>
       </w:r>
     </w:p>
-    <w:bookmarkEnd w:id="40"/>
-    <w:bookmarkStart w:id="41" w:name="after-the-import"/>
+    <w:bookmarkEnd w:id="91"/>
+    <w:bookmarkStart w:id="92" w:name="after-the-import"/>
     <w:p>
       <w:pPr>
         <w:pStyle w:val="Heading2"/>
@@ -5876,8 +7654,8 @@
         <w:t xml:space="preserve">for test and production.</w:t>
       </w:r>
     </w:p>
-    <w:bookmarkEnd w:id="41"/>
-    <w:bookmarkStart w:id="42" w:name="troubleshooting-and-faq"/>
+    <w:bookmarkEnd w:id="92"/>
+    <w:bookmarkStart w:id="93" w:name="troubleshooting-and-faq"/>
     <w:p>
       <w:pPr>
         <w:pStyle w:val="Heading2"/>
@@ -5977,7 +7755,7 @@
                 <w:bCs/>
                 <w:b/>
               </w:rPr>
-              <w:t xml:space="preserve">Files → Remove all…</w:t>
+              <w:t xml:space="preserve">Manage files… → Remove all…</w:t>
             </w:r>
           </w:p>
         </w:tc>
@@ -6509,8 +8287,8 @@
         </w:tc>
       </w:tr>
     </w:tbl>
-    <w:bookmarkEnd w:id="42"/>
-    <w:bookmarkStart w:id="43" w:name="reference-the-workbook-layout"/>
+    <w:bookmarkEnd w:id="93"/>
+    <w:bookmarkStart w:id="94" w:name="reference-the-workbook-layout"/>
     <w:p>
       <w:pPr>
         <w:pStyle w:val="Heading2"/>
@@ -6550,13 +8328,13 @@
           <w:bCs/>
           <w:b/>
         </w:rPr>
-        <w:t xml:space="preserve">Template → Download blank template</w:t>
-      </w:r>
-      <w:r>
-        <w:t xml:space="preserve"> </w:t>
-      </w:r>
-      <w:r>
-        <w:t xml:space="preserve">in the page gives you an empty copy.</w:t>
+        <w:t xml:space="preserve">More ▾ → Template → Download blank template</w:t>
+      </w:r>
+      <w:r>
+        <w:t xml:space="preserve"> </w:t>
+      </w:r>
+      <w:r>
+        <w:t xml:space="preserve">gives you an empty copy.</w:t>
       </w:r>
     </w:p>
     <w:p>
@@ -7860,7 +9638,7 @@
         <w:t xml:space="preserve">, and written to the file with the first value you save in them. A column you add to the template’s header row is read, shown, filterable and editable too.</w:t>
       </w:r>
     </w:p>
-    <w:bookmarkEnd w:id="43"/>
+    <w:bookmarkEnd w:id="94"/>
     <w:sectPr/>
   </w:body>
 </w:document>

</xml_diff>

<commit_message>
Data Model Explorer 1.9.2: ERD opens at screen resolution
The first view of the ERD is sized to the screen, not squeezed into the panel,
so large models are readable straight away; Fit still fits the panel.
Guide updated.

Co-Authored-By: Claude Opus 5.5 <noreply@anthropic.com>
Claude-Session: https://claude.ai/code/session_01SKe3s5TvTWyeqUT38hd6Ss
</commit_message>
<xml_diff>
--- a/data-model-explorer/docs/User_Guide.docx
+++ b/data-model-explorer/docs/User_Guide.docx
@@ -45,7 +45,7 @@
         <w:t xml:space="preserve"> </w:t>
       </w:r>
       <w:r>
-        <w:t xml:space="preserve">1.9.1</w:t>
+        <w:t xml:space="preserve">1.9.2</w:t>
       </w:r>
       <w:r>
         <w:t xml:space="preserve"> </w:t>
@@ -276,7 +276,7 @@
         <w:pStyle w:val="BodyText"/>
       </w:pPr>
       <w:r>
-        <w:t xml:space="preserve">This guide describes version 1.9.1. The latest file is in the SharePointPCF repository under</w:t>
+        <w:t xml:space="preserve">This guide describes version 1.9.2. The latest file is in the SharePointPCF repository under</w:t>
       </w:r>
       <w:r>
         <w:t xml:space="preserve"> </w:t>
@@ -2678,6 +2678,30 @@
       </w:r>
       <w:r>
         <w:t xml:space="preserve">starts again. Layouts are remembered per selection.</w:t>
+      </w:r>
+    </w:p>
+    <w:p>
+      <w:pPr>
+        <w:pStyle w:val="FirstParagraph"/>
+      </w:pPr>
+      <w:r>
+        <w:t xml:space="preserve">The diagram opens at the size of your screen, so a large model is readable straight away even where part of it runs past the panel: drag the background or scroll to move around, use the mouse wheel to zoom, or click</w:t>
+      </w:r>
+      <w:r>
+        <w:t xml:space="preserve"> </w:t>
+      </w:r>
+      <w:r>
+        <w:rPr>
+          <w:bCs/>
+          <w:b/>
+        </w:rPr>
+        <w:t xml:space="preserve">Fit</w:t>
+      </w:r>
+      <w:r>
+        <w:t xml:space="preserve"> </w:t>
+      </w:r>
+      <w:r>
+        <w:t xml:space="preserve">to see it all in the panel.</w:t>
       </w:r>
     </w:p>
     <w:p>

</xml_diff>

<commit_message>
1.9.3: hide relationships per table in the ERD
Each table in the ERD list shows its relationship count; clicking it lists the
table's own lookups, lookups to it and N:N relationships, and unticking one hides
it from the diagram and every export. Hide all / Show all per table, show all
overall, layout kept, choice remembered in the browser.

Also fixes Colour by area failing to draw when the diagram includes referenced
tables (Mermaid rejects a 1.5px line width), and lets the ERD's left panel
scroll as a whole so the table list is not squeezed out on shorter screens.
User guide (Markdown and Word) updated with a marked screenshot.

Co-Authored-By: Claude Opus 5.5 <noreply@anthropic.com>
Claude-Session: https://claude.ai/code/session_01SKe3s5TvTWyeqUT38hd6Ss
</commit_message>
<xml_diff>
--- a/data-model-explorer/docs/User_Guide.docx
+++ b/data-model-explorer/docs/User_Guide.docx
@@ -45,7 +45,7 @@
         <w:t xml:space="preserve"> </w:t>
       </w:r>
       <w:r>
-        <w:t xml:space="preserve">1.9.2</w:t>
+        <w:t xml:space="preserve">1.9.3</w:t>
       </w:r>
       <w:r>
         <w:t xml:space="preserve"> </w:t>
@@ -57,7 +57,7 @@
         <w:t xml:space="preserve"> </w:t>
       </w:r>
       <w:r>
-        <w:t xml:space="preserve">22</w:t>
+        <w:t xml:space="preserve">23</w:t>
       </w:r>
       <w:r>
         <w:t xml:space="preserve"> </w:t>
@@ -276,7 +276,7 @@
         <w:pStyle w:val="BodyText"/>
       </w:pPr>
       <w:r>
-        <w:t xml:space="preserve">This guide describes version 1.9.2. The latest file is in the SharePointPCF repository under</w:t>
+        <w:t xml:space="preserve">This guide describes version 1.9.3. The latest file is in the SharePointPCF repository under</w:t>
       </w:r>
       <w:r>
         <w:t xml:space="preserve"> </w:t>
@@ -2444,7 +2444,7 @@
       </w:r>
     </w:p>
     <w:bookmarkEnd w:id="40"/>
-    <w:bookmarkStart w:id="44" w:name="the-erd"/>
+    <w:bookmarkStart w:id="47" w:name="the-erd"/>
     <w:p>
       <w:pPr>
         <w:pStyle w:val="Heading2"/>
@@ -2682,26 +2682,88 @@
     </w:p>
     <w:p>
       <w:pPr>
-        <w:pStyle w:val="FirstParagraph"/>
-      </w:pPr>
-      <w:r>
-        <w:t xml:space="preserve">The diagram opens at the size of your screen, so a large model is readable straight away even where part of it runs past the panel: drag the background or scroll to move around, use the mouse wheel to zoom, or click</w:t>
-      </w:r>
-      <w:r>
-        <w:t xml:space="preserve"> </w:t>
-      </w:r>
-      <w:r>
-        <w:rPr>
-          <w:bCs/>
-          <w:b/>
-        </w:rPr>
-        <w:t xml:space="preserve">Fit</w:t>
-      </w:r>
-      <w:r>
-        <w:t xml:space="preserve"> </w:t>
-      </w:r>
-      <w:r>
-        <w:t xml:space="preserve">to see it all in the panel.</w:t>
+        <w:numPr>
+          <w:ilvl w:val="0"/>
+          <w:numId w:val="1003"/>
+        </w:numPr>
+        <w:pStyle w:val="Compact"/>
+      </w:pPr>
+      <w:r>
+        <w:t xml:space="preserve">To leave out particular relationships, click the count next to a table (for example</w:t>
+      </w:r>
+      <w:r>
+        <w:t xml:space="preserve"> </w:t>
+      </w:r>
+      <w:r>
+        <w:rPr>
+          <w:bCs/>
+          <w:b/>
+        </w:rPr>
+        <w:t xml:space="preserve">3 rel ▾</w:t>
+      </w:r>
+      <w:r>
+        <w:t xml:space="preserve">). It lists the table’s own lookups (→), the lookups to it from other tables (←) and its N:N relationships (↔). Untick any to hide them from the diagram and its exports;</w:t>
+      </w:r>
+      <w:r>
+        <w:t xml:space="preserve"> </w:t>
+      </w:r>
+      <w:r>
+        <w:rPr>
+          <w:bCs/>
+          <w:b/>
+        </w:rPr>
+        <w:t xml:space="preserve">Hide all</w:t>
+      </w:r>
+      <w:r>
+        <w:t xml:space="preserve"> </w:t>
+      </w:r>
+      <w:r>
+        <w:t xml:space="preserve">and</w:t>
+      </w:r>
+      <w:r>
+        <w:t xml:space="preserve"> </w:t>
+      </w:r>
+      <w:r>
+        <w:rPr>
+          <w:bCs/>
+          <w:b/>
+        </w:rPr>
+        <w:t xml:space="preserve">Show all</w:t>
+      </w:r>
+      <w:r>
+        <w:t xml:space="preserve"> </w:t>
+      </w:r>
+      <w:r>
+        <w:t xml:space="preserve">work for the whole table. The button then reads, for example,</w:t>
+      </w:r>
+      <w:r>
+        <w:t xml:space="preserve"> </w:t>
+      </w:r>
+      <w:r>
+        <w:rPr>
+          <w:bCs/>
+          <w:b/>
+        </w:rPr>
+        <w:t xml:space="preserve">1 of 3 hidden</w:t>
+      </w:r>
+      <w:r>
+        <w:t xml:space="preserve">, and</w:t>
+      </w:r>
+      <w:r>
+        <w:t xml:space="preserve"> </w:t>
+      </w:r>
+      <w:r>
+        <w:rPr>
+          <w:bCs/>
+          <w:b/>
+        </w:rPr>
+        <w:t xml:space="preserve">show all</w:t>
+      </w:r>
+      <w:r>
+        <w:t xml:space="preserve"> </w:t>
+      </w:r>
+      <w:r>
+        <w:t xml:space="preserve">above the list brings every hidden relationship back. The tables stay where they are, and the choice is remembered in this browser.</w:t>
       </w:r>
     </w:p>
     <w:p>
@@ -2713,12 +2775,12 @@
           <wp:inline>
             <wp:extent cx="5334000" cy="3185583"/>
             <wp:effectExtent b="0" l="0" r="0" t="0"/>
-            <wp:docPr descr="The ERD" title="" id="42" name="Picture"/>
+            <wp:docPr descr="Hiding a table’s relationships" title="" id="42" name="Picture"/>
             <a:graphic>
               <a:graphicData uri="http://schemas.openxmlformats.org/drawingml/2006/picture">
                 <pic:pic>
                   <pic:nvPicPr>
-                    <pic:cNvPr descr="images/05-erd.png" id="43" name="Picture"/>
+                    <pic:cNvPr descr="images/18-erd-hide.png" id="43" name="Picture"/>
                     <pic:cNvPicPr>
                       <a:picLocks noChangeArrowheads="1" noChangeAspect="1"/>
                     </pic:cNvPicPr>
@@ -2756,7 +2818,7 @@
         <w:pStyle w:val="ImageCaption"/>
       </w:pPr>
       <w:r>
-        <w:t xml:space="preserve">The ERD</w:t>
+        <w:t xml:space="preserve">Hiding a table’s relationships</w:t>
       </w:r>
     </w:p>
     <w:p>
@@ -2774,7 +2836,7 @@
         <w:t xml:space="preserve"> </w:t>
       </w:r>
       <w:r>
-        <w:t xml:space="preserve">All tables ·</w:t>
+        <w:t xml:space="preserve">The table’s relationships ·</w:t>
       </w:r>
       <w:r>
         <w:t xml:space="preserve"> </w:t>
@@ -2790,7 +2852,7 @@
         <w:t xml:space="preserve"> </w:t>
       </w:r>
       <w:r>
-        <w:t xml:space="preserve">Keys + lookups ·</w:t>
+        <w:t xml:space="preserve">Untick to hide ·</w:t>
       </w:r>
       <w:r>
         <w:t xml:space="preserve"> </w:t>
@@ -2806,7 +2868,7 @@
         <w:t xml:space="preserve"> </w:t>
       </w:r>
       <w:r>
-        <w:t xml:space="preserve">Export to draw.io</w:t>
+        <w:t xml:space="preserve">Show all</w:t>
       </w:r>
     </w:p>
     <w:p>
@@ -2814,338 +2876,23 @@
         <w:pStyle w:val="BodyText"/>
       </w:pPr>
       <w:r>
-        <w:rPr>
-          <w:bCs/>
-          <w:b/>
-        </w:rPr>
-        <w:t xml:space="preserve">Reading the lines.</w:t>
-      </w:r>
-      <w:r>
-        <w:t xml:space="preserve"> </w:t>
-      </w:r>
-      <w:r>
-        <w:t xml:space="preserve">A line shows its ends (one or many) only where the relationship type is recorded in the workbook. A relationship whose type isn’t recorded is drawn as a plain grey line and listed in Checks for review; N:N relationships are dashed. Custom tables have a pink border; standard tables and tables referenced but not in the workbook have a plain one.</w:t>
-      </w:r>
-    </w:p>
-    <w:p>
-      <w:pPr>
-        <w:pStyle w:val="BodyText"/>
-      </w:pPr>
-      <w:r>
-        <w:rPr>
-          <w:bCs/>
-          <w:b/>
-        </w:rPr>
-        <w:t xml:space="preserve">Options.</w:t>
-      </w:r>
-      <w:r>
-        <w:t xml:space="preserve"> </w:t>
-      </w:r>
-      <w:r>
-        <w:t xml:space="preserve">Show tables that selected tables look up to; hide tables with no relationships; also show tables that are not in the workbook; merge lines between the same two tables; hide user, team and business unit.</w:t>
-      </w:r>
-    </w:p>
-    <w:p>
-      <w:pPr>
-        <w:pStyle w:val="BodyText"/>
-      </w:pPr>
-      <w:r>
-        <w:rPr>
-          <w:bCs/>
-          <w:b/>
-        </w:rPr>
-        <w:t xml:space="preserve">Exports.</w:t>
-      </w:r>
-      <w:r>
-        <w:t xml:space="preserve"> </w:t>
-      </w:r>
-      <w:r>
-        <w:rPr>
-          <w:bCs/>
-          <w:b/>
-        </w:rPr>
-        <w:t xml:space="preserve">draw.io</w:t>
-      </w:r>
-      <w:r>
-        <w:t xml:space="preserve"> </w:t>
-      </w:r>
-      <w:r>
-        <w:t xml:space="preserve">(an editable diagram),</w:t>
-      </w:r>
-      <w:r>
-        <w:t xml:space="preserve"> </w:t>
-      </w:r>
-      <w:r>
-        <w:rPr>
-          <w:bCs/>
-          <w:b/>
-        </w:rPr>
-        <w:t xml:space="preserve">SVG</w:t>
-      </w:r>
-      <w:r>
-        <w:t xml:space="preserve">,</w:t>
-      </w:r>
-      <w:r>
-        <w:t xml:space="preserve"> </w:t>
-      </w:r>
-      <w:r>
-        <w:rPr>
-          <w:bCs/>
-          <w:b/>
-        </w:rPr>
-        <w:t xml:space="preserve">PNG</w:t>
-      </w:r>
-      <w:r>
-        <w:t xml:space="preserve">,</w:t>
-      </w:r>
-      <w:r>
-        <w:t xml:space="preserve"> </w:t>
-      </w:r>
-      <w:r>
-        <w:rPr>
-          <w:bCs/>
-          <w:b/>
-        </w:rPr>
-        <w:t xml:space="preserve">.mmd</w:t>
-      </w:r>
-      <w:r>
-        <w:t xml:space="preserve"> </w:t>
-      </w:r>
-      <w:r>
-        <w:t xml:space="preserve">and</w:t>
-      </w:r>
-      <w:r>
-        <w:t xml:space="preserve"> </w:t>
-      </w:r>
-      <w:r>
-        <w:rPr>
-          <w:bCs/>
-          <w:b/>
-        </w:rPr>
-        <w:t xml:space="preserve">Copy Mermaid</w:t>
-      </w:r>
-      <w:r>
-        <w:t xml:space="preserve"> </w:t>
-      </w:r>
-      <w:r>
-        <w:t xml:space="preserve">(the Mermaid source). With many tables, draw a few dozen at a time: a whole large model is slow to lay out and hard to read.</w:t>
-      </w:r>
-    </w:p>
-    <w:bookmarkEnd w:id="44"/>
-    <w:bookmarkStart w:id="48" w:name="browsing-and-searching-tables"/>
-    <w:p>
-      <w:pPr>
-        <w:pStyle w:val="Heading2"/>
-      </w:pPr>
-      <w:r>
-        <w:t xml:space="preserve">Browsing and searching tables</w:t>
-      </w:r>
-    </w:p>
-    <w:p>
-      <w:pPr>
-        <w:pStyle w:val="FirstParagraph"/>
-      </w:pPr>
-      <w:r>
-        <w:t xml:space="preserve">Every table tab is a page: its details along the top, counts by field type, and the field list.</w:t>
-      </w:r>
-      <w:r>
-        <w:t xml:space="preserve"> </w:t>
-      </w:r>
-      <w:r>
-        <w:rPr>
-          <w:bCs/>
-          <w:b/>
-        </w:rPr>
-        <w:t xml:space="preserve">All fields</w:t>
-      </w:r>
-      <w:r>
-        <w:t xml:space="preserve"> </w:t>
-      </w:r>
-      <w:r>
-        <w:t xml:space="preserve">in the sidebar lists every field of every table in one searchable view.</w:t>
-      </w:r>
-    </w:p>
-    <w:p>
-      <w:pPr>
-        <w:numPr>
-          <w:ilvl w:val="0"/>
-          <w:numId w:val="1004"/>
-        </w:numPr>
-        <w:pStyle w:val="Compact"/>
-      </w:pPr>
-      <w:r>
-        <w:rPr>
-          <w:bCs/>
-          <w:b/>
-        </w:rPr>
-        <w:t xml:space="preserve">Sidebar.</w:t>
-      </w:r>
-      <w:r>
-        <w:t xml:space="preserve"> </w:t>
-      </w:r>
-      <w:r>
-        <w:t xml:space="preserve">Tables grouped by area, with their field and lookup counts. Type in the box at the top to filter by name or logical name.</w:t>
-      </w:r>
-    </w:p>
-    <w:p>
-      <w:pPr>
-        <w:numPr>
-          <w:ilvl w:val="0"/>
-          <w:numId w:val="1004"/>
-        </w:numPr>
-        <w:pStyle w:val="Compact"/>
-      </w:pPr>
-      <w:r>
-        <w:rPr>
-          <w:bCs/>
-          <w:b/>
-        </w:rPr>
-        <w:t xml:space="preserve">Search.</w:t>
-      </w:r>
-      <w:r>
-        <w:t xml:space="preserve"> </w:t>
-      </w:r>
-      <w:r>
-        <w:t xml:space="preserve">The box in the header (shortcut</w:t>
-      </w:r>
-      <w:r>
-        <w:t xml:space="preserve"> </w:t>
-      </w:r>
-      <w:r>
-        <w:rPr>
-          <w:rStyle w:val="VerbatimChar"/>
-        </w:rPr>
-        <w:t xml:space="preserve">/</w:t>
-      </w:r>
-      <w:r>
-        <w:t xml:space="preserve">) searches the open table, or every field in</w:t>
-      </w:r>
-      <w:r>
-        <w:t xml:space="preserve"> </w:t>
-      </w:r>
-      <w:r>
-        <w:rPr>
-          <w:bCs/>
-          <w:b/>
-        </w:rPr>
-        <w:t xml:space="preserve">All fields</w:t>
-      </w:r>
-      <w:r>
-        <w:t xml:space="preserve">.</w:t>
-      </w:r>
-    </w:p>
-    <w:p>
-      <w:pPr>
-        <w:numPr>
-          <w:ilvl w:val="0"/>
-          <w:numId w:val="1004"/>
-        </w:numPr>
-        <w:pStyle w:val="Compact"/>
-      </w:pPr>
-      <w:r>
-        <w:rPr>
-          <w:bCs/>
-          <w:b/>
-        </w:rPr>
-        <w:t xml:space="preserve">Column filters.</w:t>
-      </w:r>
-      <w:r>
-        <w:t xml:space="preserve"> </w:t>
-      </w:r>
-      <w:r>
-        <w:t xml:space="preserve">The funnel icon on any column header filters by its values. Active filters show above the grid with a × to clear each one.</w:t>
-      </w:r>
-    </w:p>
-    <w:p>
-      <w:pPr>
-        <w:numPr>
-          <w:ilvl w:val="0"/>
-          <w:numId w:val="1004"/>
-        </w:numPr>
-        <w:pStyle w:val="Compact"/>
-      </w:pPr>
-      <w:r>
-        <w:rPr>
-          <w:bCs/>
-          <w:b/>
-        </w:rPr>
-        <w:t xml:space="preserve">Quick filters.</w:t>
-      </w:r>
-      <w:r>
-        <w:t xml:space="preserve"> </w:t>
-      </w:r>
-      <w:r>
-        <w:rPr>
-          <w:bCs/>
-          <w:b/>
-        </w:rPr>
-        <w:t xml:space="preserve">Edited only</w:t>
-      </w:r>
-      <w:r>
-        <w:t xml:space="preserve"> </w:t>
-      </w:r>
-      <w:r>
-        <w:t xml:space="preserve">shows rows you have changed;</w:t>
-      </w:r>
-      <w:r>
-        <w:t xml:space="preserve"> </w:t>
-      </w:r>
-      <w:r>
-        <w:rPr>
-          <w:bCs/>
-          <w:b/>
-        </w:rPr>
-        <w:t xml:space="preserve">Area</w:t>
-      </w:r>
-      <w:r>
-        <w:t xml:space="preserve"> </w:t>
-      </w:r>
-      <w:r>
-        <w:t xml:space="preserve">(in All fields) limits the list to areas; the counts by field type filter to that type when clicked.</w:t>
-      </w:r>
-    </w:p>
-    <w:p>
-      <w:pPr>
-        <w:numPr>
-          <w:ilvl w:val="0"/>
-          <w:numId w:val="1004"/>
-        </w:numPr>
-        <w:pStyle w:val="Compact"/>
-      </w:pPr>
-      <w:r>
-        <w:rPr>
-          <w:bCs/>
-          <w:b/>
-        </w:rPr>
-        <w:t xml:space="preserve">Columns ▾</w:t>
-      </w:r>
-      <w:r>
-        <w:t xml:space="preserve"> </w:t>
-      </w:r>
-      <w:r>
-        <w:t xml:space="preserve">shows or hides columns. Schema Name, Type and Relationship Name are hidden by default.</w:t>
-      </w:r>
-    </w:p>
-    <w:p>
-      <w:pPr>
-        <w:numPr>
-          <w:ilvl w:val="0"/>
-          <w:numId w:val="1004"/>
-        </w:numPr>
-        <w:pStyle w:val="Compact"/>
-      </w:pPr>
-      <w:r>
-        <w:rPr>
-          <w:bCs/>
-          <w:b/>
-        </w:rPr>
-        <w:t xml:space="preserve">Expand / Collapse all rows</w:t>
-      </w:r>
-      <w:r>
-        <w:t xml:space="preserve"> </w:t>
-      </w:r>
-      <w:r>
-        <w:t xml:space="preserve">switches between full text and two-line rows; the ▾ on a row does it for that row.</w:t>
+        <w:t xml:space="preserve">The diagram opens at the size of your screen, so a large model is readable straight away even where part of it runs past the panel: drag the background or scroll to move around, use the mouse wheel to zoom, or click</w:t>
+      </w:r>
+      <w:r>
+        <w:t xml:space="preserve"> </w:t>
+      </w:r>
+      <w:r>
+        <w:rPr>
+          <w:bCs/>
+          <w:b/>
+        </w:rPr>
+        <w:t xml:space="preserve">Fit</w:t>
+      </w:r>
+      <w:r>
+        <w:t xml:space="preserve"> </w:t>
+      </w:r>
+      <w:r>
+        <w:t xml:space="preserve">to see it all in the panel.</w:t>
       </w:r>
     </w:p>
     <w:p>
@@ -3157,18 +2904,18 @@
           <wp:inline>
             <wp:extent cx="5334000" cy="3185583"/>
             <wp:effectExtent b="0" l="0" r="0" t="0"/>
-            <wp:docPr descr="A table page" title="" id="46" name="Picture"/>
+            <wp:docPr descr="The ERD" title="" id="45" name="Picture"/>
             <a:graphic>
               <a:graphicData uri="http://schemas.openxmlformats.org/drawingml/2006/picture">
                 <pic:pic>
                   <pic:nvPicPr>
-                    <pic:cNvPr descr="images/06-table.png" id="47" name="Picture"/>
+                    <pic:cNvPr descr="images/05-erd.png" id="46" name="Picture"/>
                     <pic:cNvPicPr>
                       <a:picLocks noChangeArrowheads="1" noChangeAspect="1"/>
                     </pic:cNvPicPr>
                   </pic:nvPicPr>
                   <pic:blipFill>
-                    <a:blip r:embed="rId45"/>
+                    <a:blip r:embed="rId44"/>
                     <a:stretch>
                       <a:fillRect/>
                     </a:stretch>
@@ -3200,6 +2947,450 @@
         <w:pStyle w:val="ImageCaption"/>
       </w:pPr>
       <w:r>
+        <w:t xml:space="preserve">The ERD</w:t>
+      </w:r>
+    </w:p>
+    <w:p>
+      <w:pPr>
+        <w:pStyle w:val="BodyText"/>
+      </w:pPr>
+      <w:r>
+        <w:rPr>
+          <w:bCs/>
+          <w:b/>
+        </w:rPr>
+        <w:t xml:space="preserve">1</w:t>
+      </w:r>
+      <w:r>
+        <w:t xml:space="preserve"> </w:t>
+      </w:r>
+      <w:r>
+        <w:t xml:space="preserve">All tables ·</w:t>
+      </w:r>
+      <w:r>
+        <w:t xml:space="preserve"> </w:t>
+      </w:r>
+      <w:r>
+        <w:rPr>
+          <w:bCs/>
+          <w:b/>
+        </w:rPr>
+        <w:t xml:space="preserve">2</w:t>
+      </w:r>
+      <w:r>
+        <w:t xml:space="preserve"> </w:t>
+      </w:r>
+      <w:r>
+        <w:t xml:space="preserve">Keys + lookups ·</w:t>
+      </w:r>
+      <w:r>
+        <w:t xml:space="preserve"> </w:t>
+      </w:r>
+      <w:r>
+        <w:rPr>
+          <w:bCs/>
+          <w:b/>
+        </w:rPr>
+        <w:t xml:space="preserve">3</w:t>
+      </w:r>
+      <w:r>
+        <w:t xml:space="preserve"> </w:t>
+      </w:r>
+      <w:r>
+        <w:t xml:space="preserve">Export to draw.io</w:t>
+      </w:r>
+    </w:p>
+    <w:p>
+      <w:pPr>
+        <w:pStyle w:val="BodyText"/>
+      </w:pPr>
+      <w:r>
+        <w:rPr>
+          <w:bCs/>
+          <w:b/>
+        </w:rPr>
+        <w:t xml:space="preserve">Reading the lines.</w:t>
+      </w:r>
+      <w:r>
+        <w:t xml:space="preserve"> </w:t>
+      </w:r>
+      <w:r>
+        <w:t xml:space="preserve">A line shows its ends (one or many) only where the relationship type is recorded in the workbook. A relationship whose type isn’t recorded is drawn as a plain grey line and listed in Checks for review; N:N relationships are dashed. Custom tables have a pink border; standard tables and tables referenced but not in the workbook have a plain one.</w:t>
+      </w:r>
+    </w:p>
+    <w:p>
+      <w:pPr>
+        <w:pStyle w:val="BodyText"/>
+      </w:pPr>
+      <w:r>
+        <w:rPr>
+          <w:bCs/>
+          <w:b/>
+        </w:rPr>
+        <w:t xml:space="preserve">Options.</w:t>
+      </w:r>
+      <w:r>
+        <w:t xml:space="preserve"> </w:t>
+      </w:r>
+      <w:r>
+        <w:t xml:space="preserve">Show tables that selected tables look up to; hide tables with no relationships; also show tables that are not in the workbook; merge lines between the same two tables; hide user, team and business unit.</w:t>
+      </w:r>
+    </w:p>
+    <w:p>
+      <w:pPr>
+        <w:pStyle w:val="BodyText"/>
+      </w:pPr>
+      <w:r>
+        <w:rPr>
+          <w:bCs/>
+          <w:b/>
+        </w:rPr>
+        <w:t xml:space="preserve">Exports.</w:t>
+      </w:r>
+      <w:r>
+        <w:t xml:space="preserve"> </w:t>
+      </w:r>
+      <w:r>
+        <w:rPr>
+          <w:bCs/>
+          <w:b/>
+        </w:rPr>
+        <w:t xml:space="preserve">draw.io</w:t>
+      </w:r>
+      <w:r>
+        <w:t xml:space="preserve"> </w:t>
+      </w:r>
+      <w:r>
+        <w:t xml:space="preserve">(an editable diagram),</w:t>
+      </w:r>
+      <w:r>
+        <w:t xml:space="preserve"> </w:t>
+      </w:r>
+      <w:r>
+        <w:rPr>
+          <w:bCs/>
+          <w:b/>
+        </w:rPr>
+        <w:t xml:space="preserve">SVG</w:t>
+      </w:r>
+      <w:r>
+        <w:t xml:space="preserve">,</w:t>
+      </w:r>
+      <w:r>
+        <w:t xml:space="preserve"> </w:t>
+      </w:r>
+      <w:r>
+        <w:rPr>
+          <w:bCs/>
+          <w:b/>
+        </w:rPr>
+        <w:t xml:space="preserve">PNG</w:t>
+      </w:r>
+      <w:r>
+        <w:t xml:space="preserve">,</w:t>
+      </w:r>
+      <w:r>
+        <w:t xml:space="preserve"> </w:t>
+      </w:r>
+      <w:r>
+        <w:rPr>
+          <w:bCs/>
+          <w:b/>
+        </w:rPr>
+        <w:t xml:space="preserve">.mmd</w:t>
+      </w:r>
+      <w:r>
+        <w:t xml:space="preserve"> </w:t>
+      </w:r>
+      <w:r>
+        <w:t xml:space="preserve">and</w:t>
+      </w:r>
+      <w:r>
+        <w:t xml:space="preserve"> </w:t>
+      </w:r>
+      <w:r>
+        <w:rPr>
+          <w:bCs/>
+          <w:b/>
+        </w:rPr>
+        <w:t xml:space="preserve">Copy Mermaid</w:t>
+      </w:r>
+      <w:r>
+        <w:t xml:space="preserve"> </w:t>
+      </w:r>
+      <w:r>
+        <w:t xml:space="preserve">(the Mermaid source). With many tables, draw a few dozen at a time: a whole large model is slow to lay out and hard to read.</w:t>
+      </w:r>
+    </w:p>
+    <w:bookmarkEnd w:id="47"/>
+    <w:bookmarkStart w:id="51" w:name="browsing-and-searching-tables"/>
+    <w:p>
+      <w:pPr>
+        <w:pStyle w:val="Heading2"/>
+      </w:pPr>
+      <w:r>
+        <w:t xml:space="preserve">Browsing and searching tables</w:t>
+      </w:r>
+    </w:p>
+    <w:p>
+      <w:pPr>
+        <w:pStyle w:val="FirstParagraph"/>
+      </w:pPr>
+      <w:r>
+        <w:t xml:space="preserve">Every table tab is a page: its details along the top, counts by field type, and the field list.</w:t>
+      </w:r>
+      <w:r>
+        <w:t xml:space="preserve"> </w:t>
+      </w:r>
+      <w:r>
+        <w:rPr>
+          <w:bCs/>
+          <w:b/>
+        </w:rPr>
+        <w:t xml:space="preserve">All fields</w:t>
+      </w:r>
+      <w:r>
+        <w:t xml:space="preserve"> </w:t>
+      </w:r>
+      <w:r>
+        <w:t xml:space="preserve">in the sidebar lists every field of every table in one searchable view.</w:t>
+      </w:r>
+    </w:p>
+    <w:p>
+      <w:pPr>
+        <w:numPr>
+          <w:ilvl w:val="0"/>
+          <w:numId w:val="1004"/>
+        </w:numPr>
+        <w:pStyle w:val="Compact"/>
+      </w:pPr>
+      <w:r>
+        <w:rPr>
+          <w:bCs/>
+          <w:b/>
+        </w:rPr>
+        <w:t xml:space="preserve">Sidebar.</w:t>
+      </w:r>
+      <w:r>
+        <w:t xml:space="preserve"> </w:t>
+      </w:r>
+      <w:r>
+        <w:t xml:space="preserve">Tables grouped by area, with their field and lookup counts. Type in the box at the top to filter by name or logical name.</w:t>
+      </w:r>
+    </w:p>
+    <w:p>
+      <w:pPr>
+        <w:numPr>
+          <w:ilvl w:val="0"/>
+          <w:numId w:val="1004"/>
+        </w:numPr>
+        <w:pStyle w:val="Compact"/>
+      </w:pPr>
+      <w:r>
+        <w:rPr>
+          <w:bCs/>
+          <w:b/>
+        </w:rPr>
+        <w:t xml:space="preserve">Search.</w:t>
+      </w:r>
+      <w:r>
+        <w:t xml:space="preserve"> </w:t>
+      </w:r>
+      <w:r>
+        <w:t xml:space="preserve">The box in the header (shortcut</w:t>
+      </w:r>
+      <w:r>
+        <w:t xml:space="preserve"> </w:t>
+      </w:r>
+      <w:r>
+        <w:rPr>
+          <w:rStyle w:val="VerbatimChar"/>
+        </w:rPr>
+        <w:t xml:space="preserve">/</w:t>
+      </w:r>
+      <w:r>
+        <w:t xml:space="preserve">) searches the open table, or every field in</w:t>
+      </w:r>
+      <w:r>
+        <w:t xml:space="preserve"> </w:t>
+      </w:r>
+      <w:r>
+        <w:rPr>
+          <w:bCs/>
+          <w:b/>
+        </w:rPr>
+        <w:t xml:space="preserve">All fields</w:t>
+      </w:r>
+      <w:r>
+        <w:t xml:space="preserve">.</w:t>
+      </w:r>
+    </w:p>
+    <w:p>
+      <w:pPr>
+        <w:numPr>
+          <w:ilvl w:val="0"/>
+          <w:numId w:val="1004"/>
+        </w:numPr>
+        <w:pStyle w:val="Compact"/>
+      </w:pPr>
+      <w:r>
+        <w:rPr>
+          <w:bCs/>
+          <w:b/>
+        </w:rPr>
+        <w:t xml:space="preserve">Column filters.</w:t>
+      </w:r>
+      <w:r>
+        <w:t xml:space="preserve"> </w:t>
+      </w:r>
+      <w:r>
+        <w:t xml:space="preserve">The funnel icon on any column header filters by its values. Active filters show above the grid with a × to clear each one.</w:t>
+      </w:r>
+    </w:p>
+    <w:p>
+      <w:pPr>
+        <w:numPr>
+          <w:ilvl w:val="0"/>
+          <w:numId w:val="1004"/>
+        </w:numPr>
+        <w:pStyle w:val="Compact"/>
+      </w:pPr>
+      <w:r>
+        <w:rPr>
+          <w:bCs/>
+          <w:b/>
+        </w:rPr>
+        <w:t xml:space="preserve">Quick filters.</w:t>
+      </w:r>
+      <w:r>
+        <w:t xml:space="preserve"> </w:t>
+      </w:r>
+      <w:r>
+        <w:rPr>
+          <w:bCs/>
+          <w:b/>
+        </w:rPr>
+        <w:t xml:space="preserve">Edited only</w:t>
+      </w:r>
+      <w:r>
+        <w:t xml:space="preserve"> </w:t>
+      </w:r>
+      <w:r>
+        <w:t xml:space="preserve">shows rows you have changed;</w:t>
+      </w:r>
+      <w:r>
+        <w:t xml:space="preserve"> </w:t>
+      </w:r>
+      <w:r>
+        <w:rPr>
+          <w:bCs/>
+          <w:b/>
+        </w:rPr>
+        <w:t xml:space="preserve">Area</w:t>
+      </w:r>
+      <w:r>
+        <w:t xml:space="preserve"> </w:t>
+      </w:r>
+      <w:r>
+        <w:t xml:space="preserve">(in All fields) limits the list to areas; the counts by field type filter to that type when clicked.</w:t>
+      </w:r>
+    </w:p>
+    <w:p>
+      <w:pPr>
+        <w:numPr>
+          <w:ilvl w:val="0"/>
+          <w:numId w:val="1004"/>
+        </w:numPr>
+        <w:pStyle w:val="Compact"/>
+      </w:pPr>
+      <w:r>
+        <w:rPr>
+          <w:bCs/>
+          <w:b/>
+        </w:rPr>
+        <w:t xml:space="preserve">Columns ▾</w:t>
+      </w:r>
+      <w:r>
+        <w:t xml:space="preserve"> </w:t>
+      </w:r>
+      <w:r>
+        <w:t xml:space="preserve">shows or hides columns. Schema Name, Type and Relationship Name are hidden by default.</w:t>
+      </w:r>
+    </w:p>
+    <w:p>
+      <w:pPr>
+        <w:numPr>
+          <w:ilvl w:val="0"/>
+          <w:numId w:val="1004"/>
+        </w:numPr>
+        <w:pStyle w:val="Compact"/>
+      </w:pPr>
+      <w:r>
+        <w:rPr>
+          <w:bCs/>
+          <w:b/>
+        </w:rPr>
+        <w:t xml:space="preserve">Expand / Collapse all rows</w:t>
+      </w:r>
+      <w:r>
+        <w:t xml:space="preserve"> </w:t>
+      </w:r>
+      <w:r>
+        <w:t xml:space="preserve">switches between full text and two-line rows; the ▾ on a row does it for that row.</w:t>
+      </w:r>
+    </w:p>
+    <w:p>
+      <w:pPr>
+        <w:pStyle w:val="CaptionedFigure"/>
+      </w:pPr>
+      <w:r>
+        <w:drawing>
+          <wp:inline>
+            <wp:extent cx="5334000" cy="3185583"/>
+            <wp:effectExtent b="0" l="0" r="0" t="0"/>
+            <wp:docPr descr="A table page" title="" id="49" name="Picture"/>
+            <a:graphic>
+              <a:graphicData uri="http://schemas.openxmlformats.org/drawingml/2006/picture">
+                <pic:pic>
+                  <pic:nvPicPr>
+                    <pic:cNvPr descr="images/06-table.png" id="50" name="Picture"/>
+                    <pic:cNvPicPr>
+                      <a:picLocks noChangeArrowheads="1" noChangeAspect="1"/>
+                    </pic:cNvPicPr>
+                  </pic:nvPicPr>
+                  <pic:blipFill>
+                    <a:blip r:embed="rId48"/>
+                    <a:stretch>
+                      <a:fillRect/>
+                    </a:stretch>
+                  </pic:blipFill>
+                  <pic:spPr bwMode="auto">
+                    <a:xfrm>
+                      <a:off x="0" y="0"/>
+                      <a:ext cx="5334000" cy="3185583"/>
+                    </a:xfrm>
+                    <a:prstGeom prst="rect">
+                      <a:avLst/>
+                    </a:prstGeom>
+                    <a:noFill/>
+                    <a:ln w="9525">
+                      <a:noFill/>
+                      <a:headEnd/>
+                      <a:tailEnd/>
+                    </a:ln>
+                  </pic:spPr>
+                </pic:pic>
+              </a:graphicData>
+            </a:graphic>
+          </wp:inline>
+        </w:drawing>
+      </w:r>
+    </w:p>
+    <w:p>
+      <w:pPr>
+        <w:pStyle w:val="ImageCaption"/>
+      </w:pPr>
+      <w:r>
         <w:t xml:space="preserve">A table page</w:t>
       </w:r>
     </w:p>
@@ -3285,8 +3476,8 @@
         <w:t xml:space="preserve">✎ Table details</w:t>
       </w:r>
     </w:p>
-    <w:bookmarkEnd w:id="48"/>
-    <w:bookmarkStart w:id="52" w:name="editing-values"/>
+    <w:bookmarkEnd w:id="51"/>
+    <w:bookmarkStart w:id="55" w:name="editing-values"/>
     <w:p>
       <w:pPr>
         <w:pStyle w:val="Heading2"/>
@@ -3504,18 +3695,18 @@
           <wp:inline>
             <wp:extent cx="5334000" cy="1820060"/>
             <wp:effectExtent b="0" l="0" r="0" t="0"/>
-            <wp:docPr descr="Editing a cell: a dropdown for Required Level" title="" id="50" name="Picture"/>
+            <wp:docPr descr="Editing a cell: a dropdown for Required Level" title="" id="53" name="Picture"/>
             <a:graphic>
               <a:graphicData uri="http://schemas.openxmlformats.org/drawingml/2006/picture">
                 <pic:pic>
                   <pic:nvPicPr>
-                    <pic:cNvPr descr="images/07-edit.png" id="51" name="Picture"/>
+                    <pic:cNvPr descr="images/07-edit.png" id="54" name="Picture"/>
                     <pic:cNvPicPr>
                       <a:picLocks noChangeArrowheads="1" noChangeAspect="1"/>
                     </pic:cNvPicPr>
                   </pic:nvPicPr>
                   <pic:blipFill>
-                    <a:blip r:embed="rId49"/>
+                    <a:blip r:embed="rId52"/>
                     <a:stretch>
                       <a:fillRect/>
                     </a:stretch>
@@ -3550,8 +3741,8 @@
         <w:t xml:space="preserve">Editing a cell: a dropdown for Required Level</w:t>
       </w:r>
     </w:p>
-    <w:bookmarkEnd w:id="52"/>
-    <w:bookmarkStart w:id="56" w:name="adding-fields-and-relationships"/>
+    <w:bookmarkEnd w:id="55"/>
+    <w:bookmarkStart w:id="59" w:name="adding-fields-and-relationships"/>
     <w:p>
       <w:pPr>
         <w:pStyle w:val="Heading2"/>
@@ -3871,18 +4062,18 @@
           <wp:inline>
             <wp:extent cx="4828032" cy="2696870"/>
             <wp:effectExtent b="0" l="0" r="0" t="0"/>
-            <wp:docPr descr="The Add field dialog" title="" id="54" name="Picture"/>
+            <wp:docPr descr="The Add field dialog" title="" id="57" name="Picture"/>
             <a:graphic>
               <a:graphicData uri="http://schemas.openxmlformats.org/drawingml/2006/picture">
                 <pic:pic>
                   <pic:nvPicPr>
-                    <pic:cNvPr descr="images/09-addfield.png" id="55" name="Picture"/>
+                    <pic:cNvPr descr="images/09-addfield.png" id="58" name="Picture"/>
                     <pic:cNvPicPr>
                       <a:picLocks noChangeArrowheads="1" noChangeAspect="1"/>
                     </pic:cNvPicPr>
                   </pic:nvPicPr>
                   <pic:blipFill>
-                    <a:blip r:embed="rId53"/>
+                    <a:blip r:embed="rId56"/>
                     <a:stretch>
                       <a:fillRect/>
                     </a:stretch>
@@ -4055,8 +4246,8 @@
         <w:t xml:space="preserve">adds a blank row.</w:t>
       </w:r>
     </w:p>
-    <w:bookmarkEnd w:id="56"/>
-    <w:bookmarkStart w:id="60" w:name="X8f6e01d66b0ce2e5aaa6ec04719c75900d03161"/>
+    <w:bookmarkEnd w:id="59"/>
+    <w:bookmarkStart w:id="63" w:name="X8f6e01d66b0ce2e5aaa6ec04719c75900d03161"/>
     <w:p>
       <w:pPr>
         <w:pStyle w:val="Heading2"/>
@@ -4257,18 +4448,18 @@
           <wp:inline>
             <wp:extent cx="3264407" cy="2830777"/>
             <wp:effectExtent b="0" l="0" r="0" t="0"/>
-            <wp:docPr descr="A field’s panel" title="" id="58" name="Picture"/>
+            <wp:docPr descr="A field’s panel" title="" id="61" name="Picture"/>
             <a:graphic>
               <a:graphicData uri="http://schemas.openxmlformats.org/drawingml/2006/picture">
                 <pic:pic>
                   <pic:nvPicPr>
-                    <pic:cNvPr descr="images/08-keys.png" id="59" name="Picture"/>
+                    <pic:cNvPr descr="images/08-keys.png" id="62" name="Picture"/>
                     <pic:cNvPicPr>
                       <a:picLocks noChangeArrowheads="1" noChangeAspect="1"/>
                     </pic:cNvPicPr>
                   </pic:nvPicPr>
                   <pic:blipFill>
-                    <a:blip r:embed="rId57"/>
+                    <a:blip r:embed="rId60"/>
                     <a:stretch>
                       <a:fillRect/>
                     </a:stretch>
@@ -4361,8 +4552,8 @@
         <w:t xml:space="preserve">Dataverse primary keys are always unique identifiers (GUIDs) created with the table. Marking a text or number field as the key is flagged in Checks; to keep another field’s values unique, use an alternate key in Dataverse.</w:t>
       </w:r>
     </w:p>
-    <w:bookmarkEnd w:id="60"/>
-    <w:bookmarkStart w:id="64" w:name="reviewing-and-undoing-your-changes"/>
+    <w:bookmarkEnd w:id="63"/>
+    <w:bookmarkStart w:id="67" w:name="reviewing-and-undoing-your-changes"/>
     <w:p>
       <w:pPr>
         <w:pStyle w:val="Heading2"/>
@@ -4459,18 +4650,18 @@
           <wp:inline>
             <wp:extent cx="3264407" cy="1851455"/>
             <wp:effectExtent b="0" l="0" r="0" t="0"/>
-            <wp:docPr descr="The Changes panel" title="" id="62" name="Picture"/>
+            <wp:docPr descr="The Changes panel" title="" id="65" name="Picture"/>
             <a:graphic>
               <a:graphicData uri="http://schemas.openxmlformats.org/drawingml/2006/picture">
                 <pic:pic>
                   <pic:nvPicPr>
-                    <pic:cNvPr descr="images/10-changes.png" id="63" name="Picture"/>
+                    <pic:cNvPr descr="images/10-changes.png" id="66" name="Picture"/>
                     <pic:cNvPicPr>
                       <a:picLocks noChangeArrowheads="1" noChangeAspect="1"/>
                     </pic:cNvPicPr>
                   </pic:nvPicPr>
                   <pic:blipFill>
-                    <a:blip r:embed="rId61"/>
+                    <a:blip r:embed="rId64"/>
                     <a:stretch>
                       <a:fillRect/>
                     </a:stretch>
@@ -4571,8 +4762,8 @@
         <w:t xml:space="preserve">Revert all</w:t>
       </w:r>
     </w:p>
-    <w:bookmarkEnd w:id="64"/>
-    <w:bookmarkStart w:id="71" w:name="saving-and-exporting"/>
+    <w:bookmarkEnd w:id="67"/>
+    <w:bookmarkStart w:id="74" w:name="saving-and-exporting"/>
     <w:p>
       <w:pPr>
         <w:pStyle w:val="Heading2"/>
@@ -4590,18 +4781,18 @@
           <wp:inline>
             <wp:extent cx="2807208" cy="3393060"/>
             <wp:effectExtent b="0" l="0" r="0" t="0"/>
-            <wp:docPr descr="The Export menu" title="" id="66" name="Picture"/>
+            <wp:docPr descr="The Export menu" title="" id="69" name="Picture"/>
             <a:graphic>
               <a:graphicData uri="http://schemas.openxmlformats.org/drawingml/2006/picture">
                 <pic:pic>
                   <pic:nvPicPr>
-                    <pic:cNvPr descr="images/11-export.png" id="67" name="Picture"/>
+                    <pic:cNvPr descr="images/11-export.png" id="70" name="Picture"/>
                     <pic:cNvPicPr>
                       <a:picLocks noChangeArrowheads="1" noChangeAspect="1"/>
                     </pic:cNvPicPr>
                   </pic:nvPicPr>
                   <pic:blipFill>
-                    <a:blip r:embed="rId65"/>
+                    <a:blip r:embed="rId68"/>
                     <a:stretch>
                       <a:fillRect/>
                     </a:stretch>
@@ -5054,18 +5245,18 @@
           <wp:inline>
             <wp:extent cx="2880360" cy="1532937"/>
             <wp:effectExtent b="0" l="0" r="0" t="0"/>
-            <wp:docPr descr="Naming the file" title="" id="69" name="Picture"/>
+            <wp:docPr descr="Naming the file" title="" id="72" name="Picture"/>
             <a:graphic>
               <a:graphicData uri="http://schemas.openxmlformats.org/drawingml/2006/picture">
                 <pic:pic>
                   <pic:nvPicPr>
-                    <pic:cNvPr descr="images/12-filename.png" id="70" name="Picture"/>
+                    <pic:cNvPr descr="images/12-filename.png" id="73" name="Picture"/>
                     <pic:cNvPicPr>
                       <a:picLocks noChangeArrowheads="1" noChangeAspect="1"/>
                     </pic:cNvPicPr>
                   </pic:nvPicPr>
                   <pic:blipFill>
-                    <a:blip r:embed="rId68"/>
+                    <a:blip r:embed="rId71"/>
                     <a:stretch>
                       <a:fillRect/>
                     </a:stretch>
@@ -5134,8 +5325,8 @@
         <w:t xml:space="preserve">Download</w:t>
       </w:r>
     </w:p>
-    <w:bookmarkEnd w:id="71"/>
-    <w:bookmarkStart w:id="82" w:name="updating-the-template"/>
+    <w:bookmarkEnd w:id="74"/>
+    <w:bookmarkStart w:id="85" w:name="updating-the-template"/>
     <w:p>
       <w:pPr>
         <w:pStyle w:val="Heading2"/>
@@ -5165,7 +5356,7 @@
         <w:t xml:space="preserve">. The page has the current FormusPro template built in; you can replace it with your own.</w:t>
       </w:r>
     </w:p>
-    <w:bookmarkStart w:id="75" w:name="checking-a-workbook-against-the-template"/>
+    <w:bookmarkStart w:id="78" w:name="checking-a-workbook-against-the-template"/>
     <w:p>
       <w:pPr>
         <w:pStyle w:val="Heading3"/>
@@ -5183,18 +5374,18 @@
           <wp:inline>
             <wp:extent cx="1755648" cy="1380134"/>
             <wp:effectExtent b="0" l="0" r="0" t="0"/>
-            <wp:docPr descr="The More menu" title="" id="73" name="Picture"/>
+            <wp:docPr descr="The More menu" title="" id="76" name="Picture"/>
             <a:graphic>
               <a:graphicData uri="http://schemas.openxmlformats.org/drawingml/2006/picture">
                 <pic:pic>
                   <pic:nvPicPr>
-                    <pic:cNvPr descr="images/14-more.png" id="74" name="Picture"/>
+                    <pic:cNvPr descr="images/14-more.png" id="77" name="Picture"/>
                     <pic:cNvPicPr>
                       <a:picLocks noChangeArrowheads="1" noChangeAspect="1"/>
                     </pic:cNvPicPr>
                   </pic:nvPicPr>
                   <pic:blipFill>
-                    <a:blip r:embed="rId72"/>
+                    <a:blip r:embed="rId75"/>
                     <a:stretch>
                       <a:fillRect/>
                     </a:stretch>
@@ -5300,8 +5491,8 @@
         <w:t xml:space="preserve">. The panel lists tables not in the template, extra columns the workbook has, and columns or details it is missing. A pink count on the button shows how many tables differ.</w:t>
       </w:r>
     </w:p>
-    <w:bookmarkEnd w:id="75"/>
-    <w:bookmarkStart w:id="76" w:name="bringing-an-older-workbook-up-to-date"/>
+    <w:bookmarkEnd w:id="78"/>
+    <w:bookmarkStart w:id="79" w:name="bringing-an-older-workbook-up-to-date"/>
     <w:p>
       <w:pPr>
         <w:pStyle w:val="Heading3"/>
@@ -5413,8 +5604,8 @@
         <w:t xml:space="preserve">: the whole workbook rebuilt in the current template layout, every column and detail included.</w:t>
       </w:r>
     </w:p>
-    <w:bookmarkEnd w:id="76"/>
-    <w:bookmarkStart w:id="80" w:name="using-your-own-template"/>
+    <w:bookmarkEnd w:id="79"/>
+    <w:bookmarkStart w:id="83" w:name="using-your-own-template"/>
     <w:p>
       <w:pPr>
         <w:pStyle w:val="Heading3"/>
@@ -5540,18 +5731,18 @@
           <wp:inline>
             <wp:extent cx="3264407" cy="2621270"/>
             <wp:effectExtent b="0" l="0" r="0" t="0"/>
-            <wp:docPr descr="The Template panel" title="" id="78" name="Picture"/>
+            <wp:docPr descr="The Template panel" title="" id="81" name="Picture"/>
             <a:graphic>
               <a:graphicData uri="http://schemas.openxmlformats.org/drawingml/2006/picture">
                 <pic:pic>
                   <pic:nvPicPr>
-                    <pic:cNvPr descr="images/15-template.png" id="79" name="Picture"/>
+                    <pic:cNvPr descr="images/15-template.png" id="82" name="Picture"/>
                     <pic:cNvPicPr>
                       <a:picLocks noChangeArrowheads="1" noChangeAspect="1"/>
                     </pic:cNvPicPr>
                   </pic:nvPicPr>
                   <pic:blipFill>
-                    <a:blip r:embed="rId77"/>
+                    <a:blip r:embed="rId80"/>
                     <a:stretch>
                       <a:fillRect/>
                     </a:stretch>
@@ -5636,8 +5827,8 @@
         <w:t xml:space="preserve">Reset to bundled</w:t>
       </w:r>
     </w:p>
-    <w:bookmarkEnd w:id="80"/>
-    <w:bookmarkStart w:id="81" w:name="what-you-can-change"/>
+    <w:bookmarkEnd w:id="83"/>
+    <w:bookmarkStart w:id="84" w:name="what-you-can-change"/>
     <w:p>
       <w:pPr>
         <w:pStyle w:val="Heading3"/>
@@ -5871,9 +6062,9 @@
         <w:t xml:space="preserve">A new column needs a code change only if the solution builder or a check should use it.</w:t>
       </w:r>
     </w:p>
-    <w:bookmarkEnd w:id="81"/>
-    <w:bookmarkEnd w:id="82"/>
-    <w:bookmarkStart w:id="86" w:name="comparing-with-dataverse"/>
+    <w:bookmarkEnd w:id="84"/>
+    <w:bookmarkEnd w:id="85"/>
+    <w:bookmarkStart w:id="89" w:name="comparing-with-dataverse"/>
     <w:p>
       <w:pPr>
         <w:pStyle w:val="Heading2"/>
@@ -6088,18 +6279,18 @@
           <wp:inline>
             <wp:extent cx="3264407" cy="2777182"/>
             <wp:effectExtent b="0" l="0" r="0" t="0"/>
-            <wp:docPr descr="The Dataverse check panel" title="" id="84" name="Picture"/>
+            <wp:docPr descr="The Dataverse check panel" title="" id="87" name="Picture"/>
             <a:graphic>
               <a:graphicData uri="http://schemas.openxmlformats.org/drawingml/2006/picture">
                 <pic:pic>
                   <pic:nvPicPr>
-                    <pic:cNvPr descr="images/16-dataverse.png" id="85" name="Picture"/>
+                    <pic:cNvPr descr="images/16-dataverse.png" id="88" name="Picture"/>
                     <pic:cNvPicPr>
                       <a:picLocks noChangeArrowheads="1" noChangeAspect="1"/>
                     </pic:cNvPicPr>
                   </pic:nvPicPr>
                   <pic:blipFill>
-                    <a:blip r:embed="rId83"/>
+                    <a:blip r:embed="rId86"/>
                     <a:stretch>
                       <a:fillRect/>
                     </a:stretch>
@@ -6373,8 +6564,8 @@
         </w:tc>
       </w:tr>
     </w:tbl>
-    <w:bookmarkEnd w:id="86"/>
-    <w:bookmarkStart w:id="90" w:name="generating-a-dataverse-solution"/>
+    <w:bookmarkEnd w:id="89"/>
+    <w:bookmarkStart w:id="93" w:name="generating-a-dataverse-solution"/>
     <w:p>
       <w:pPr>
         <w:pStyle w:val="Heading2"/>
@@ -6500,18 +6691,18 @@
           <wp:inline>
             <wp:extent cx="4828032" cy="3574694"/>
             <wp:effectExtent b="0" l="0" r="0" t="0"/>
-            <wp:docPr descr="The Build a Dataverse solution dialog" title="" id="88" name="Picture"/>
+            <wp:docPr descr="The Build a Dataverse solution dialog" title="" id="91" name="Picture"/>
             <a:graphic>
               <a:graphicData uri="http://schemas.openxmlformats.org/drawingml/2006/picture">
                 <pic:pic>
                   <pic:nvPicPr>
-                    <pic:cNvPr descr="images/17-solution.png" id="89" name="Picture"/>
+                    <pic:cNvPr descr="images/17-solution.png" id="92" name="Picture"/>
                     <pic:cNvPicPr>
                       <a:picLocks noChangeArrowheads="1" noChangeAspect="1"/>
                     </pic:cNvPicPr>
                   </pic:nvPicPr>
                   <pic:blipFill>
-                    <a:blip r:embed="rId87"/>
+                    <a:blip r:embed="rId90"/>
                     <a:stretch>
                       <a:fillRect/>
                     </a:stretch>
@@ -7151,8 +7342,8 @@
         </w:tc>
       </w:tr>
     </w:tbl>
-    <w:bookmarkEnd w:id="90"/>
-    <w:bookmarkStart w:id="91" w:name="importing-the-solution"/>
+    <w:bookmarkEnd w:id="93"/>
+    <w:bookmarkStart w:id="94" w:name="importing-the-solution"/>
     <w:p>
       <w:pPr>
         <w:pStyle w:val="Heading2"/>
@@ -7521,8 +7712,8 @@
         <w:t xml:space="preserve">downloads the script on its own, to import a solution zip you already have.</w:t>
       </w:r>
     </w:p>
-    <w:bookmarkEnd w:id="91"/>
-    <w:bookmarkStart w:id="92" w:name="after-the-import"/>
+    <w:bookmarkEnd w:id="94"/>
+    <w:bookmarkStart w:id="95" w:name="after-the-import"/>
     <w:p>
       <w:pPr>
         <w:pStyle w:val="Heading2"/>
@@ -7678,8 +7869,8 @@
         <w:t xml:space="preserve">for test and production.</w:t>
       </w:r>
     </w:p>
-    <w:bookmarkEnd w:id="92"/>
-    <w:bookmarkStart w:id="93" w:name="troubleshooting-and-faq"/>
+    <w:bookmarkEnd w:id="95"/>
+    <w:bookmarkStart w:id="96" w:name="troubleshooting-and-faq"/>
     <w:p>
       <w:pPr>
         <w:pStyle w:val="Heading2"/>
@@ -8311,8 +8502,8 @@
         </w:tc>
       </w:tr>
     </w:tbl>
-    <w:bookmarkEnd w:id="93"/>
-    <w:bookmarkStart w:id="94" w:name="reference-the-workbook-layout"/>
+    <w:bookmarkEnd w:id="96"/>
+    <w:bookmarkStart w:id="97" w:name="reference-the-workbook-layout"/>
     <w:p>
       <w:pPr>
         <w:pStyle w:val="Heading2"/>
@@ -9662,7 +9853,7 @@
         <w:t xml:space="preserve">, and written to the file with the first value you save in them. A column you add to the template’s header row is read, shown, filterable and editable too.</w:t>
       </w:r>
     </w:p>
-    <w:bookmarkEnd w:id="94"/>
+    <w:bookmarkEnd w:id="97"/>
     <w:sectPr/>
   </w:body>
 </w:document>

</xml_diff>